<commit_message>
Optimize book front matter to match references: title page, bonafide cert, declaration, acknowledgement
</commit_message>
<xml_diff>
--- a/book/Zenthiqa_Project_Book.docx
+++ b/book/Zenthiqa_Project_Book.docx
@@ -2,6 +2,227 @@
 <file path=word/document.xml><?xml version="1.0" encoding="utf-8"?>
 <w:document xmlns:wpc="http://schemas.microsoft.com/office/word/2010/wordprocessingCanvas" xmlns:mo="http://schemas.microsoft.com/office/mac/office/2008/main" xmlns:mc="http://schemas.openxmlformats.org/markup-compatibility/2006" xmlns:mv="urn:schemas-microsoft-com:mac:vml" xmlns:o="urn:schemas-microsoft-com:office:office" xmlns:r="http://schemas.openxmlformats.org/officeDocument/2006/relationships" xmlns:m="http://schemas.openxmlformats.org/officeDocument/2006/math" xmlns:v="urn:schemas-microsoft-com:vml" xmlns:wp14="http://schemas.microsoft.com/office/word/2010/wordprocessingDrawing" xmlns:wp="http://schemas.openxmlformats.org/drawingml/2006/wordprocessingDrawing" xmlns:w10="urn:schemas-microsoft-com:office:word" xmlns:w="http://schemas.openxmlformats.org/wordprocessingml/2006/main" xmlns:w14="http://schemas.microsoft.com/office/word/2010/wordml" xmlns:wpg="http://schemas.microsoft.com/office/word/2010/wordprocessingGroup" xmlns:wpi="http://schemas.microsoft.com/office/word/2010/wordprocessingInk" xmlns:wne="http://schemas.microsoft.com/office/word/2006/wordml" xmlns:wps="http://schemas.microsoft.com/office/word/2010/wordprocessingShape" mc:Ignorable="w14 wp14">
   <w:body>
+    <w:p/>
+    <w:p/>
+    <w:p>
+      <w:pPr>
+        <w:spacing w:line="360" w:lineRule="auto"/>
+        <w:jc w:val="center"/>
+      </w:pPr>
+      <w:r>
+        <w:rPr>
+          <w:rFonts w:ascii="Times New Roman" w:hAnsi="Times New Roman"/>
+          <w:b/>
+          <w:color w:val="C00000"/>
+          <w:sz w:val="32"/>
+        </w:rPr>
+        <w:t>ZENTHIQA: DEEP LEARNING MICROSERVICES FOR</w:t>
+        <w:br/>
+        <w:t>E-COMMERCE CUSTOMER ANALYTICS</w:t>
+      </w:r>
+    </w:p>
+    <w:p/>
+    <w:p>
+      <w:pPr>
+        <w:spacing w:line="360" w:lineRule="auto"/>
+        <w:jc w:val="center"/>
+      </w:pPr>
+      <w:r>
+        <w:rPr>
+          <w:rFonts w:ascii="Times New Roman" w:hAnsi="Times New Roman"/>
+          <w:b w:val="0"/>
+          <w:sz w:val="22"/>
+        </w:rPr>
+        <w:t>A thesis submitted in the partial fulfilment of the requirements for the award in</w:t>
+      </w:r>
+    </w:p>
+    <w:p>
+      <w:pPr>
+        <w:spacing w:line="360" w:lineRule="auto"/>
+        <w:jc w:val="center"/>
+      </w:pPr>
+      <w:r>
+        <w:rPr>
+          <w:rFonts w:ascii="Times New Roman" w:hAnsi="Times New Roman"/>
+          <w:b w:val="0"/>
+          <w:sz w:val="22"/>
+        </w:rPr>
+        <w:t>the degree of</w:t>
+      </w:r>
+    </w:p>
+    <w:p/>
+    <w:p>
+      <w:pPr>
+        <w:spacing w:line="360" w:lineRule="auto"/>
+        <w:jc w:val="center"/>
+      </w:pPr>
+      <w:r>
+        <w:rPr>
+          <w:rFonts w:ascii="Times New Roman" w:hAnsi="Times New Roman"/>
+          <w:b/>
+          <w:sz w:val="26"/>
+        </w:rPr>
+        <w:t>BACHELOR OF TECHNOLOGY</w:t>
+      </w:r>
+    </w:p>
+    <w:p>
+      <w:pPr>
+        <w:spacing w:line="360" w:lineRule="auto"/>
+        <w:jc w:val="center"/>
+      </w:pPr>
+      <w:r>
+        <w:rPr>
+          <w:rFonts w:ascii="Times New Roman" w:hAnsi="Times New Roman"/>
+          <w:b w:val="0"/>
+          <w:sz w:val="24"/>
+        </w:rPr>
+        <w:t>in</w:t>
+      </w:r>
+    </w:p>
+    <w:p>
+      <w:pPr>
+        <w:spacing w:line="360" w:lineRule="auto"/>
+        <w:jc w:val="center"/>
+      </w:pPr>
+      <w:r>
+        <w:rPr>
+          <w:rFonts w:ascii="Times New Roman" w:hAnsi="Times New Roman"/>
+          <w:b/>
+          <w:color w:val="C00000"/>
+          <w:sz w:val="26"/>
+        </w:rPr>
+        <w:t>ARTIFICIAL INTELLIGENCE AND DATA SCIENCE</w:t>
+      </w:r>
+    </w:p>
+    <w:p/>
+    <w:p>
+      <w:pPr>
+        <w:spacing w:line="360" w:lineRule="auto"/>
+        <w:jc w:val="center"/>
+      </w:pPr>
+      <w:r>
+        <w:rPr>
+          <w:rFonts w:ascii="Times New Roman" w:hAnsi="Times New Roman"/>
+          <w:b w:val="0"/>
+          <w:sz w:val="24"/>
+        </w:rPr>
+        <w:t>Submitted by</w:t>
+      </w:r>
+    </w:p>
+    <w:p/>
+    <w:p>
+      <w:pPr>
+        <w:spacing w:line="360" w:lineRule="auto"/>
+        <w:jc w:val="center"/>
+      </w:pPr>
+      <w:r>
+        <w:rPr>
+          <w:rFonts w:ascii="Times New Roman" w:hAnsi="Times New Roman"/>
+          <w:b/>
+          <w:sz w:val="24"/>
+        </w:rPr>
+        <w:t>GUDABANDI NITHIN KUMAR          : 23L61A5418</w:t>
+      </w:r>
+    </w:p>
+    <w:p>
+      <w:pPr>
+        <w:spacing w:line="360" w:lineRule="auto"/>
+        <w:jc w:val="center"/>
+      </w:pPr>
+      <w:r>
+        <w:rPr>
+          <w:rFonts w:ascii="Times New Roman" w:hAnsi="Times New Roman"/>
+          <w:b/>
+          <w:sz w:val="24"/>
+        </w:rPr>
+        <w:t>BURAVELLI PARDHASARADHI         : 23L61A5408</w:t>
+      </w:r>
+    </w:p>
+    <w:p>
+      <w:pPr>
+        <w:spacing w:line="360" w:lineRule="auto"/>
+        <w:jc w:val="center"/>
+      </w:pPr>
+      <w:r>
+        <w:rPr>
+          <w:rFonts w:ascii="Times New Roman" w:hAnsi="Times New Roman"/>
+          <w:b/>
+          <w:sz w:val="24"/>
+        </w:rPr>
+        <w:t>PECHETTI DEVENDRA VENKATA SAI   : 24L65A5406</w:t>
+      </w:r>
+    </w:p>
+    <w:p>
+      <w:pPr>
+        <w:spacing w:line="360" w:lineRule="auto"/>
+        <w:jc w:val="center"/>
+      </w:pPr>
+      <w:r>
+        <w:rPr>
+          <w:rFonts w:ascii="Times New Roman" w:hAnsi="Times New Roman"/>
+          <w:b/>
+          <w:sz w:val="24"/>
+        </w:rPr>
+        <w:t>MANTRI UMADEVI                  : 23L61A5425</w:t>
+      </w:r>
+    </w:p>
+    <w:p/>
+    <w:p>
+      <w:pPr>
+        <w:spacing w:line="360" w:lineRule="auto"/>
+        <w:jc w:val="center"/>
+      </w:pPr>
+      <w:r>
+        <w:rPr>
+          <w:rFonts w:ascii="Times New Roman" w:hAnsi="Times New Roman"/>
+          <w:b w:val="0"/>
+          <w:sz w:val="24"/>
+        </w:rPr>
+        <w:t>Under the guidance of</w:t>
+      </w:r>
+    </w:p>
+    <w:p>
+      <w:pPr>
+        <w:spacing w:line="360" w:lineRule="auto"/>
+        <w:jc w:val="center"/>
+      </w:pPr>
+      <w:r>
+        <w:rPr>
+          <w:rFonts w:ascii="Times New Roman" w:hAnsi="Times New Roman"/>
+          <w:b/>
+          <w:sz w:val="24"/>
+        </w:rPr>
+        <w:t>Mrs. P. Gayatri</w:t>
+      </w:r>
+    </w:p>
+    <w:p>
+      <w:pPr>
+        <w:spacing w:line="360" w:lineRule="auto"/>
+        <w:jc w:val="center"/>
+      </w:pPr>
+      <w:r>
+        <w:rPr>
+          <w:rFonts w:ascii="Times New Roman" w:hAnsi="Times New Roman"/>
+          <w:b w:val="0"/>
+          <w:sz w:val="22"/>
+        </w:rPr>
+        <w:t>Assistant Professor,</w:t>
+      </w:r>
+    </w:p>
+    <w:p>
+      <w:pPr>
+        <w:spacing w:line="360" w:lineRule="auto"/>
+        <w:jc w:val="center"/>
+      </w:pPr>
+      <w:r>
+        <w:rPr>
+          <w:rFonts w:ascii="Times New Roman" w:hAnsi="Times New Roman"/>
+          <w:b w:val="0"/>
+          <w:sz w:val="22"/>
+        </w:rPr>
+        <w:t>Department of AI &amp; DS</w:t>
+      </w:r>
+    </w:p>
     <w:p/>
     <w:p>
       <w:pPr>
@@ -52,8 +273,23 @@
         <w:rPr>
           <w:rFonts w:ascii="Times New Roman" w:hAnsi="Times New Roman"/>
           <w:b/>
-          <w:color w:val="C00000"/>
-          <w:sz w:val="28"/>
+          <w:color w:val="0000CC"/>
+          <w:sz w:val="26"/>
+        </w:rPr>
+        <w:t>DEPARTMENT OF ARTIFICIAL INTELLIGENCE AND DATA SCIENCE</w:t>
+      </w:r>
+    </w:p>
+    <w:p>
+      <w:pPr>
+        <w:spacing w:line="360" w:lineRule="auto"/>
+        <w:jc w:val="center"/>
+      </w:pPr>
+      <w:r>
+        <w:rPr>
+          <w:rFonts w:ascii="Times New Roman" w:hAnsi="Times New Roman"/>
+          <w:b/>
+          <w:color w:val="0000CC"/>
+          <w:sz w:val="26"/>
         </w:rPr>
         <w:t>CHAITANYA ENGINEERING COLLEGE</w:t>
       </w:r>
@@ -69,7 +305,41 @@
           <w:b w:val="0"/>
           <w:sz w:val="20"/>
         </w:rPr>
-        <w:t>Approved by AICTE, New Delhi  |  Accredited by NAAC</w:t>
+        <w:t>(APPROVED BY AICTE &amp; AFFILIATED TO JNTU GURAJADA, VIZIANAGARAM)</w:t>
+      </w:r>
+    </w:p>
+    <w:p/>
+    <w:p>
+      <w:pPr>
+        <w:spacing w:line="360" w:lineRule="auto"/>
+        <w:jc w:val="center"/>
+      </w:pPr>
+      <w:r>
+        <w:rPr>
+          <w:rFonts w:ascii="Times New Roman" w:hAnsi="Times New Roman"/>
+          <w:b/>
+          <w:sz w:val="24"/>
+        </w:rPr>
+        <w:t>2026 – 2027</w:t>
+      </w:r>
+    </w:p>
+    <w:p>
+      <w:r>
+        <w:br w:type="page"/>
+      </w:r>
+    </w:p>
+    <w:p>
+      <w:pPr>
+        <w:spacing w:line="360" w:lineRule="auto"/>
+        <w:jc w:val="center"/>
+      </w:pPr>
+      <w:r>
+        <w:rPr>
+          <w:rFonts w:ascii="Times New Roman" w:hAnsi="Times New Roman"/>
+          <w:b/>
+          <w:sz w:val="26"/>
+        </w:rPr>
+        <w:t>CHAITANYA ENGINEERING COLLEGE</w:t>
       </w:r>
     </w:p>
     <w:p>
@@ -83,7 +353,47 @@
           <w:b w:val="0"/>
           <w:sz w:val="20"/>
         </w:rPr>
-        <w:t>Affiliated to JNTU Kakinada, Visakhapatnam, Andhra Pradesh</w:t>
+        <w:t>(Approved by AICTE, Affiliated to JNTU GURAJADA, VIZIANAGARAM)</w:t>
+      </w:r>
+    </w:p>
+    <w:p/>
+    <w:p>
+      <w:pPr>
+        <w:jc w:val="center"/>
+      </w:pPr>
+      <w:r>
+        <w:drawing>
+          <wp:inline xmlns:a="http://schemas.openxmlformats.org/drawingml/2006/main" xmlns:pic="http://schemas.openxmlformats.org/drawingml/2006/picture">
+            <wp:extent cx="2011680" cy="2011680"/>
+            <wp:docPr id="2" name="Picture 2"/>
+            <wp:cNvGraphicFramePr>
+              <a:graphicFrameLocks noChangeAspect="1"/>
+            </wp:cNvGraphicFramePr>
+            <a:graphic>
+              <a:graphicData uri="http://schemas.openxmlformats.org/drawingml/2006/picture">
+                <pic:pic>
+                  <pic:nvPicPr>
+                    <pic:cNvPr id="0" name="college_logo.jpg"/>
+                    <pic:cNvPicPr/>
+                  </pic:nvPicPr>
+                  <pic:blipFill>
+                    <a:blip r:embed="rId9"/>
+                    <a:stretch>
+                      <a:fillRect/>
+                    </a:stretch>
+                  </pic:blipFill>
+                  <pic:spPr>
+                    <a:xfrm>
+                      <a:off x="0" y="0"/>
+                      <a:ext cx="2011680" cy="2011680"/>
+                    </a:xfrm>
+                    <a:prstGeom prst="rect"/>
+                  </pic:spPr>
+                </pic:pic>
+              </a:graphicData>
+            </a:graphic>
+          </wp:inline>
+        </w:drawing>
       </w:r>
     </w:p>
     <w:p/>
@@ -96,64 +406,16 @@
         <w:rPr>
           <w:rFonts w:ascii="Times New Roman" w:hAnsi="Times New Roman"/>
           <w:b/>
-          <w:sz w:val="26"/>
-        </w:rPr>
-        <w:t>DEPARTMENT OF ARTIFICIAL INTELLIGENCE AND DATA SCIENCE</w:t>
+          <w:sz w:val="28"/>
+        </w:rPr>
+        <w:t>BONAFIDE CERTIFICATE</w:t>
       </w:r>
     </w:p>
     <w:p/>
-    <w:p/>
     <w:p>
       <w:pPr>
         <w:spacing w:line="360" w:lineRule="auto"/>
-        <w:jc w:val="center"/>
-      </w:pPr>
-      <w:r>
-        <w:rPr>
-          <w:rFonts w:ascii="Times New Roman" w:hAnsi="Times New Roman"/>
-          <w:b/>
-          <w:sz w:val="30"/>
-        </w:rPr>
-        <w:t>PROJECT REPORT</w:t>
-      </w:r>
-    </w:p>
-    <w:p>
-      <w:pPr>
-        <w:spacing w:line="360" w:lineRule="auto"/>
-        <w:jc w:val="center"/>
-      </w:pPr>
-      <w:r>
-        <w:rPr>
-          <w:rFonts w:ascii="Times New Roman" w:hAnsi="Times New Roman"/>
-          <w:b w:val="0"/>
-          <w:sz w:val="26"/>
-        </w:rPr>
-        <w:t>On</w:t>
-      </w:r>
-    </w:p>
-    <w:p/>
-    <w:p>
-      <w:pPr>
-        <w:spacing w:line="360" w:lineRule="auto"/>
-        <w:jc w:val="center"/>
-      </w:pPr>
-      <w:r>
-        <w:rPr>
-          <w:rFonts w:ascii="Times New Roman" w:hAnsi="Times New Roman"/>
-          <w:b/>
-          <w:sz w:val="32"/>
-        </w:rPr>
-        <w:t>ZENTHIQA: DEEP LEARNING MICROSERVICES FOR</w:t>
-        <w:br/>
-        <w:t>E-COMMERCE CUSTOMER ANALYTICS</w:t>
-      </w:r>
-    </w:p>
-    <w:p/>
-    <w:p/>
-    <w:p>
-      <w:pPr>
-        <w:spacing w:line="360" w:lineRule="auto"/>
-        <w:jc w:val="center"/>
+        <w:jc w:val="both"/>
       </w:pPr>
       <w:r>
         <w:rPr>
@@ -161,226 +423,10 @@
           <w:b w:val="0"/>
           <w:sz w:val="24"/>
         </w:rPr>
-        <w:t>Submitted in partial fulfillment of the requirements for the award of the degree of</w:t>
+        <w:t>This is to certify that the project titled "ZENTHIQA: DEEP LEARNING MICROSERVICES FOR E-COMMERCE CUSTOMER ANALYTICS" is a Bonafide work carried out by G. Nithin Kumar (23L61A5418), B. Pardhasaradhi (23L61A5408), P. Devendra Venkata Sai (24L65A5406), M. Umadevi (23L61A5425) as part of the IV B.Tech, II Semester curriculum in Artificial Intelligence and Data Science during the academic year 2026–2027.</w:t>
       </w:r>
     </w:p>
     <w:p/>
-    <w:p>
-      <w:pPr>
-        <w:spacing w:line="360" w:lineRule="auto"/>
-        <w:jc w:val="center"/>
-      </w:pPr>
-      <w:r>
-        <w:rPr>
-          <w:rFonts w:ascii="Times New Roman" w:hAnsi="Times New Roman"/>
-          <w:b/>
-          <w:sz w:val="26"/>
-        </w:rPr>
-        <w:t>BACHELOR OF TECHNOLOGY</w:t>
-      </w:r>
-    </w:p>
-    <w:p>
-      <w:pPr>
-        <w:spacing w:line="360" w:lineRule="auto"/>
-        <w:jc w:val="center"/>
-      </w:pPr>
-      <w:r>
-        <w:rPr>
-          <w:rFonts w:ascii="Times New Roman" w:hAnsi="Times New Roman"/>
-          <w:b w:val="0"/>
-          <w:sz w:val="24"/>
-        </w:rPr>
-        <w:t>in</w:t>
-      </w:r>
-    </w:p>
-    <w:p>
-      <w:pPr>
-        <w:spacing w:line="360" w:lineRule="auto"/>
-        <w:jc w:val="center"/>
-      </w:pPr>
-      <w:r>
-        <w:rPr>
-          <w:rFonts w:ascii="Times New Roman" w:hAnsi="Times New Roman"/>
-          <w:b/>
-          <w:sz w:val="26"/>
-        </w:rPr>
-        <w:t>ARTIFICIAL INTELLIGENCE AND DATA SCIENCE</w:t>
-      </w:r>
-    </w:p>
-    <w:p/>
-    <w:p/>
-    <w:p>
-      <w:pPr>
-        <w:spacing w:line="360" w:lineRule="auto"/>
-        <w:jc w:val="center"/>
-      </w:pPr>
-      <w:r>
-        <w:rPr>
-          <w:rFonts w:ascii="Times New Roman" w:hAnsi="Times New Roman"/>
-          <w:b/>
-          <w:sz w:val="24"/>
-        </w:rPr>
-        <w:t>Submitted by:</w:t>
-      </w:r>
-    </w:p>
-    <w:p>
-      <w:pPr>
-        <w:spacing w:line="360" w:lineRule="auto"/>
-        <w:jc w:val="center"/>
-      </w:pPr>
-      <w:r>
-        <w:rPr>
-          <w:rFonts w:ascii="Times New Roman" w:hAnsi="Times New Roman"/>
-          <w:b w:val="0"/>
-          <w:sz w:val="24"/>
-        </w:rPr>
-        <w:t>Gudabandi Nithin Kumar          23L61A5418  (Team Leader)</w:t>
-      </w:r>
-    </w:p>
-    <w:p>
-      <w:pPr>
-        <w:spacing w:line="360" w:lineRule="auto"/>
-        <w:jc w:val="center"/>
-      </w:pPr>
-      <w:r>
-        <w:rPr>
-          <w:rFonts w:ascii="Times New Roman" w:hAnsi="Times New Roman"/>
-          <w:b w:val="0"/>
-          <w:sz w:val="24"/>
-        </w:rPr>
-        <w:t>Buravelli Pardhasaradhi          23L61A5408</w:t>
-      </w:r>
-    </w:p>
-    <w:p>
-      <w:pPr>
-        <w:spacing w:line="360" w:lineRule="auto"/>
-        <w:jc w:val="center"/>
-      </w:pPr>
-      <w:r>
-        <w:rPr>
-          <w:rFonts w:ascii="Times New Roman" w:hAnsi="Times New Roman"/>
-          <w:b w:val="0"/>
-          <w:sz w:val="24"/>
-        </w:rPr>
-        <w:t>Pechetti Devendra Venkata Sai   24L65A5406</w:t>
-      </w:r>
-    </w:p>
-    <w:p>
-      <w:pPr>
-        <w:spacing w:line="360" w:lineRule="auto"/>
-        <w:jc w:val="center"/>
-      </w:pPr>
-      <w:r>
-        <w:rPr>
-          <w:rFonts w:ascii="Times New Roman" w:hAnsi="Times New Roman"/>
-          <w:b w:val="0"/>
-          <w:sz w:val="24"/>
-        </w:rPr>
-        <w:t>Mantri Umadevi                   23L61A5425</w:t>
-      </w:r>
-    </w:p>
-    <w:p/>
-    <w:p>
-      <w:pPr>
-        <w:spacing w:line="360" w:lineRule="auto"/>
-        <w:jc w:val="center"/>
-      </w:pPr>
-      <w:r>
-        <w:rPr>
-          <w:rFonts w:ascii="Times New Roman" w:hAnsi="Times New Roman"/>
-          <w:b/>
-          <w:sz w:val="24"/>
-        </w:rPr>
-        <w:t>Under the Guidance of:</w:t>
-      </w:r>
-    </w:p>
-    <w:p>
-      <w:pPr>
-        <w:spacing w:line="360" w:lineRule="auto"/>
-        <w:jc w:val="center"/>
-      </w:pPr>
-      <w:r>
-        <w:rPr>
-          <w:rFonts w:ascii="Times New Roman" w:hAnsi="Times New Roman"/>
-          <w:b/>
-          <w:sz w:val="24"/>
-        </w:rPr>
-        <w:t>Mrs. P. Gayatri</w:t>
-      </w:r>
-    </w:p>
-    <w:p>
-      <w:pPr>
-        <w:spacing w:line="360" w:lineRule="auto"/>
-        <w:jc w:val="center"/>
-      </w:pPr>
-      <w:r>
-        <w:rPr>
-          <w:rFonts w:ascii="Times New Roman" w:hAnsi="Times New Roman"/>
-          <w:b w:val="0"/>
-          <w:sz w:val="24"/>
-        </w:rPr>
-        <w:t>Assistant Professor, Department of AI &amp; DS</w:t>
-      </w:r>
-    </w:p>
-    <w:p/>
-    <w:p>
-      <w:pPr>
-        <w:spacing w:line="360" w:lineRule="auto"/>
-        <w:jc w:val="center"/>
-      </w:pPr>
-      <w:r>
-        <w:rPr>
-          <w:rFonts w:ascii="Times New Roman" w:hAnsi="Times New Roman"/>
-          <w:b/>
-          <w:sz w:val="24"/>
-        </w:rPr>
-        <w:t>Academic Year: 2026 – 2027</w:t>
-      </w:r>
-    </w:p>
-    <w:p>
-      <w:r>
-        <w:br w:type="page"/>
-      </w:r>
-    </w:p>
-    <w:p>
-      <w:pPr>
-        <w:sectPr>
-          <w:pgSz w:w="12240" w:h="15840"/>
-          <w:pgMar w:top="1440" w:right="1440" w:bottom="1440" w:left="1800" w:header="720" w:footer="720" w:gutter="0"/>
-          <w:cols w:space="720"/>
-          <w:docGrid w:linePitch="360"/>
-        </w:sectPr>
-      </w:pPr>
-    </w:p>
-    <w:p>
-      <w:pPr>
-        <w:spacing w:line="360" w:lineRule="auto"/>
-        <w:jc w:val="center"/>
-      </w:pPr>
-      <w:r>
-        <w:rPr>
-          <w:rFonts w:ascii="Times New Roman" w:hAnsi="Times New Roman"/>
-          <w:b/>
-          <w:sz w:val="28"/>
-        </w:rPr>
-        <w:t>BONAFIDE CERTIFICATE</w:t>
-      </w:r>
-    </w:p>
-    <w:p/>
-    <w:p>
-      <w:pPr>
-        <w:spacing w:line="360" w:lineRule="auto"/>
-        <w:jc w:val="both"/>
-      </w:pPr>
-      <w:r>
-        <w:rPr>
-          <w:rFonts w:ascii="Times New Roman" w:hAnsi="Times New Roman"/>
-          <w:b w:val="0"/>
-          <w:sz w:val="24"/>
-        </w:rPr>
-        <w:t>This is to certify that the project work titled "ZENTHIQA: DEEP LEARNING MICROSERVICES FOR E-COMMERCE CUSTOMER ANALYTICS" is a Bonafide work carried out by G. Nithin Kumar (23L61A5418), B. Pardhasaradhi (23L61A5408), P. Devendra Venkata Sai (24L65A5406), M. Umadevi (23L61A5425) as part of the IV B.Tech, II Semester curriculum in Artificial Intelligence and Data Science during the academic year 2026–2027.</w:t>
-      </w:r>
-    </w:p>
     <w:p/>
     <w:p/>
     <w:tbl>
@@ -388,6 +434,14 @@
         <w:tblStyle w:val="TableGrid"/>
         <w:tblW w:type="auto" w:w="0"/>
         <w:tblLook w:firstColumn="1" w:firstRow="1" w:lastColumn="0" w:lastRow="0" w:noHBand="0" w:noVBand="1" w:val="04A0"/>
+        <w:tblBorders>
+          <w:top w:val="none" w:sz="0" w:space="0" w:color="auto"/>
+          <w:left w:val="none" w:sz="0" w:space="0" w:color="auto"/>
+          <w:bottom w:val="none" w:sz="0" w:space="0" w:color="auto"/>
+          <w:right w:val="none" w:sz="0" w:space="0" w:color="auto"/>
+          <w:insideH w:val="none" w:sz="0" w:space="0" w:color="auto"/>
+          <w:insideV w:val="none" w:sz="0" w:space="0" w:color="auto"/>
+        </w:tblBorders>
       </w:tblPr>
       <w:tblGrid>
         <w:gridCol w:w="4500"/>
@@ -398,11 +452,7 @@
           <w:tcPr>
             <w:tcW w:type="dxa" w:w="4500"/>
           </w:tcPr>
-          <w:p/>
           <w:p>
-            <w:pPr>
-              <w:jc w:val="center"/>
-            </w:pPr>
             <w:r>
               <w:rPr>
                 <w:b/>
@@ -411,46 +461,56 @@
               <w:t>Project Guide</w:t>
             </w:r>
           </w:p>
+        </w:tc>
+        <w:tc>
+          <w:tcPr>
+            <w:tcW w:type="dxa" w:w="4500"/>
+          </w:tcPr>
           <w:p>
-            <w:pPr>
-              <w:jc w:val="center"/>
-            </w:pPr>
             <w:r>
               <w:rPr>
                 <w:b/>
                 <w:sz w:val="22"/>
               </w:rPr>
-              <w:t>Mrs. P. Gayatri</w:t>
+              <w:t>Head of Department</w:t>
+            </w:r>
+          </w:p>
+        </w:tc>
+      </w:tr>
+      <w:tr>
+        <w:tc>
+          <w:tcPr>
+            <w:tcW w:type="dxa" w:w="4500"/>
+          </w:tcPr>
+          <w:p/>
+          <w:p>
+            <w:r>
+              <w:rPr>
+                <w:b/>
+                <w:sz w:val="22"/>
+              </w:rPr>
+              <w:t>Mrs. P. Gayatri,</w:t>
             </w:r>
           </w:p>
           <w:p>
-            <w:pPr>
-              <w:jc w:val="center"/>
-            </w:pPr>
             <w:r>
               <w:rPr>
                 <w:b w:val="0"/>
                 <w:sz w:val="22"/>
               </w:rPr>
-              <w:t>Assistant Professor</w:t>
+              <w:t>Assistant Professor,</w:t>
             </w:r>
           </w:p>
           <w:p>
-            <w:pPr>
-              <w:jc w:val="center"/>
-            </w:pPr>
             <w:r>
               <w:rPr>
                 <w:b w:val="0"/>
                 <w:sz w:val="22"/>
               </w:rPr>
-              <w:t>Department of AI &amp; DS</w:t>
+              <w:t>Department of AI &amp; DS,</w:t>
             </w:r>
           </w:p>
           <w:p>
-            <w:pPr>
-              <w:jc w:val="center"/>
-            </w:pPr>
             <w:r>
               <w:rPr>
                 <w:b w:val="0"/>
@@ -466,57 +526,33 @@
           </w:tcPr>
           <w:p/>
           <w:p>
-            <w:pPr>
-              <w:jc w:val="center"/>
-            </w:pPr>
             <w:r>
               <w:rPr>
                 <w:b/>
                 <w:sz w:val="22"/>
               </w:rPr>
-              <w:t>Head of Department</w:t>
+              <w:t>Dr. K.N.S. Lakshmi,</w:t>
             </w:r>
           </w:p>
           <w:p>
-            <w:pPr>
-              <w:jc w:val="center"/>
-            </w:pPr>
-            <w:r>
-              <w:rPr>
-                <w:b/>
-                <w:sz w:val="22"/>
-              </w:rPr>
-              <w:t>Dr. K.N.S. Lakshmi</w:t>
-            </w:r>
-          </w:p>
-          <w:p>
-            <w:pPr>
-              <w:jc w:val="center"/>
-            </w:pPr>
             <w:r>
               <w:rPr>
                 <w:b w:val="0"/>
                 <w:sz w:val="22"/>
               </w:rPr>
-              <w:t>Professor &amp; HOD</w:t>
+              <w:t>Professor &amp; HOD,</w:t>
             </w:r>
           </w:p>
           <w:p>
-            <w:pPr>
-              <w:jc w:val="center"/>
-            </w:pPr>
             <w:r>
               <w:rPr>
                 <w:b w:val="0"/>
                 <w:sz w:val="22"/>
               </w:rPr>
-              <w:t>Department of AI</w:t>
+              <w:t>Department of AI,</w:t>
             </w:r>
           </w:p>
           <w:p>
-            <w:pPr>
-              <w:jc w:val="center"/>
-            </w:pPr>
             <w:r>
               <w:rPr>
                 <w:b w:val="0"/>
@@ -530,40 +566,32 @@
     </w:tbl>
     <w:p/>
     <w:p/>
-    <w:tbl>
-      <w:tblPr>
-        <w:tblStyle w:val="TableGrid"/>
-        <w:tblW w:type="auto" w:w="0"/>
-        <w:tblLook w:firstColumn="1" w:firstRow="1" w:lastColumn="0" w:lastRow="0" w:noHBand="0" w:noVBand="1" w:val="04A0"/>
-      </w:tblPr>
-      <w:tblGrid>
-        <w:gridCol w:w="9000"/>
-      </w:tblGrid>
-      <w:tr>
-        <w:tc>
-          <w:tcPr>
-            <w:tcW w:type="dxa" w:w="9000"/>
-          </w:tcPr>
-          <w:p/>
-          <w:p>
-            <w:pPr>
-              <w:jc w:val="left"/>
-            </w:pPr>
-            <w:r>
-              <w:rPr>
-                <w:b/>
-                <w:sz w:val="22"/>
-              </w:rPr>
-              <w:t>External Examiner</w:t>
-            </w:r>
-          </w:p>
-        </w:tc>
-      </w:tr>
-    </w:tbl>
+    <w:p>
+      <w:pPr>
+        <w:jc w:val="left"/>
+      </w:pPr>
+      <w:r>
+        <w:rPr>
+          <w:b/>
+          <w:sz w:val="22"/>
+        </w:rPr>
+        <w:t>External Examiner</w:t>
+      </w:r>
+    </w:p>
     <w:p>
       <w:r>
         <w:br w:type="page"/>
       </w:r>
+    </w:p>
+    <w:p>
+      <w:pPr>
+        <w:sectPr>
+          <w:pgSz w:w="12240" w:h="15840"/>
+          <w:pgMar w:top="1440" w:right="1440" w:bottom="1440" w:left="1800" w:header="720" w:footer="720" w:gutter="0"/>
+          <w:cols w:space="720"/>
+          <w:docGrid w:linePitch="360"/>
+        </w:sectPr>
+      </w:pPr>
     </w:p>
     <w:p>
       <w:pPr>
@@ -596,10 +624,83 @@
     </w:p>
     <w:p/>
     <w:p/>
+    <w:p/>
+    <w:p>
+      <w:pPr>
+        <w:jc w:val="right"/>
+      </w:pPr>
+      <w:r>
+        <w:rPr>
+          <w:rFonts w:ascii="Times New Roman" w:hAnsi="Times New Roman"/>
+          <w:b/>
+          <w:sz w:val="24"/>
+        </w:rPr>
+        <w:t>GUDABANDI NITHIN KUMAR          : 23L61A5418</w:t>
+      </w:r>
+    </w:p>
+    <w:p>
+      <w:pPr>
+        <w:jc w:val="right"/>
+      </w:pPr>
+      <w:r>
+        <w:rPr>
+          <w:rFonts w:ascii="Times New Roman" w:hAnsi="Times New Roman"/>
+          <w:b/>
+          <w:sz w:val="24"/>
+        </w:rPr>
+        <w:t>BURAVELLI PARDHASARADHI         : 23L61A5408</w:t>
+      </w:r>
+    </w:p>
+    <w:p>
+      <w:pPr>
+        <w:jc w:val="right"/>
+      </w:pPr>
+      <w:r>
+        <w:rPr>
+          <w:rFonts w:ascii="Times New Roman" w:hAnsi="Times New Roman"/>
+          <w:b/>
+          <w:sz w:val="24"/>
+        </w:rPr>
+        <w:t>PECHETTI DEVENDRA VENKATA SAI   : 24L65A5406</w:t>
+      </w:r>
+    </w:p>
+    <w:p>
+      <w:pPr>
+        <w:jc w:val="right"/>
+      </w:pPr>
+      <w:r>
+        <w:rPr>
+          <w:rFonts w:ascii="Times New Roman" w:hAnsi="Times New Roman"/>
+          <w:b/>
+          <w:sz w:val="24"/>
+        </w:rPr>
+        <w:t>MANTRI UMADEVI                  : 23L61A5425</w:t>
+      </w:r>
+    </w:p>
+    <w:p>
+      <w:r>
+        <w:br w:type="page"/>
+      </w:r>
+    </w:p>
     <w:p>
       <w:pPr>
         <w:spacing w:line="360" w:lineRule="auto"/>
         <w:jc w:val="center"/>
+      </w:pPr>
+      <w:r>
+        <w:rPr>
+          <w:rFonts w:ascii="Times New Roman" w:hAnsi="Times New Roman"/>
+          <w:b/>
+          <w:sz w:val="28"/>
+        </w:rPr>
+        <w:t>ACKNOWLEDGEMENT</w:t>
+      </w:r>
+    </w:p>
+    <w:p/>
+    <w:p>
+      <w:pPr>
+        <w:spacing w:line="360" w:lineRule="auto"/>
+        <w:jc w:val="both"/>
       </w:pPr>
       <w:r>
         <w:rPr>
@@ -607,13 +708,14 @@
           <w:b w:val="0"/>
           <w:sz w:val="24"/>
         </w:rPr>
-        <w:t>GUDABANDI NITHIN KUMAR           : 23L61A5418</w:t>
-      </w:r>
-    </w:p>
+        <w:t>With great solemnity and sincerity, we express our deepest sense of gratitude and pay our sincere thanks to our Project guide Mrs. P. Gayatri, Assistant Professor, Department of Artificial Intelligence and Data Science, Chaitanya Engineering College, who evinced keen interest in our efforts and provided her invaluable guidance throughout our project work. Her constant encouragement, constructive feedback, and patient mentorship were fundamental to the success of this project.</w:t>
+      </w:r>
+    </w:p>
+    <w:p/>
     <w:p>
       <w:pPr>
         <w:spacing w:line="360" w:lineRule="auto"/>
-        <w:jc w:val="center"/>
+        <w:jc w:val="both"/>
       </w:pPr>
       <w:r>
         <w:rPr>
@@ -621,13 +723,14 @@
           <w:b w:val="0"/>
           <w:sz w:val="24"/>
         </w:rPr>
-        <w:t>BURAVELLI PARDHASARADHI          : 23L61A5408</w:t>
-      </w:r>
-    </w:p>
+        <w:t>We thank our Dr. K.N.S Lakshmi, Professor, Head of the Department of Artificial Intelligence, who helped us to complete our project work in a truthful and systematic manner, and who consistently motivated us to aim for technical excellence.</w:t>
+      </w:r>
+    </w:p>
+    <w:p/>
     <w:p>
       <w:pPr>
         <w:spacing w:line="360" w:lineRule="auto"/>
-        <w:jc w:val="center"/>
+        <w:jc w:val="both"/>
       </w:pPr>
       <w:r>
         <w:rPr>
@@ -635,13 +738,14 @@
           <w:b w:val="0"/>
           <w:sz w:val="24"/>
         </w:rPr>
-        <w:t>PECHETTI DEVENDRA VENKATA SAI    : 24L65A5406</w:t>
-      </w:r>
-    </w:p>
+        <w:t>We extend our sincere gratitude to our principal Dr. K. Suresh, Ph.D., for his kind attention and valuable guidance throughout this academic programme. His leadership has created an environment of innovation and research that has greatly benefited our project work.</w:t>
+      </w:r>
+    </w:p>
+    <w:p/>
     <w:p>
       <w:pPr>
         <w:spacing w:line="360" w:lineRule="auto"/>
-        <w:jc w:val="center"/>
+        <w:jc w:val="both"/>
       </w:pPr>
       <w:r>
         <w:rPr>
@@ -649,7 +753,91 @@
           <w:b w:val="0"/>
           <w:sz w:val="24"/>
         </w:rPr>
-        <w:t>MANTRI UMADEVI                   : 23L61A5425</w:t>
+        <w:t>We wish to express gratitude to our Management Members who supported us by providing excellent laboratory infrastructure and facilities, without which the practical implementation of this project would not have been possible.</w:t>
+      </w:r>
+    </w:p>
+    <w:p/>
+    <w:p>
+      <w:pPr>
+        <w:spacing w:line="360" w:lineRule="auto"/>
+        <w:jc w:val="both"/>
+      </w:pPr>
+      <w:r>
+        <w:rPr>
+          <w:rFonts w:ascii="Times New Roman" w:hAnsi="Times New Roman"/>
+          <w:b w:val="0"/>
+          <w:sz w:val="24"/>
+        </w:rPr>
+        <w:t>We are also deeply thankful to All Staff Members of the Department of Artificial Intelligence and Data Science, for their direct and indirect support in completing this project work through their valuable suggestions and technical guidance.</w:t>
+      </w:r>
+    </w:p>
+    <w:p/>
+    <w:p>
+      <w:pPr>
+        <w:spacing w:line="360" w:lineRule="auto"/>
+        <w:jc w:val="both"/>
+      </w:pPr>
+      <w:r>
+        <w:rPr>
+          <w:rFonts w:ascii="Times New Roman" w:hAnsi="Times New Roman"/>
+          <w:b w:val="0"/>
+          <w:sz w:val="24"/>
+        </w:rPr>
+        <w:t>Above all, we acknowledge our profound gratitude to our parents and families, whose moral support, encouragement, and sacrifices have been the greatest driving force throughout our academic journey.</w:t>
+      </w:r>
+    </w:p>
+    <w:p/>
+    <w:p/>
+    <w:p>
+      <w:pPr>
+        <w:jc w:val="right"/>
+      </w:pPr>
+      <w:r>
+        <w:rPr>
+          <w:rFonts w:ascii="Times New Roman" w:hAnsi="Times New Roman"/>
+          <w:b/>
+          <w:sz w:val="24"/>
+        </w:rPr>
+        <w:t>GUDABANDI NITHIN KUMAR          : 23L61A5418</w:t>
+      </w:r>
+    </w:p>
+    <w:p>
+      <w:pPr>
+        <w:jc w:val="right"/>
+      </w:pPr>
+      <w:r>
+        <w:rPr>
+          <w:rFonts w:ascii="Times New Roman" w:hAnsi="Times New Roman"/>
+          <w:b/>
+          <w:sz w:val="24"/>
+        </w:rPr>
+        <w:t>BURAVELLI PARDHASARADHI         : 23L61A5408</w:t>
+      </w:r>
+    </w:p>
+    <w:p>
+      <w:pPr>
+        <w:jc w:val="right"/>
+      </w:pPr>
+      <w:r>
+        <w:rPr>
+          <w:rFonts w:ascii="Times New Roman" w:hAnsi="Times New Roman"/>
+          <w:b/>
+          <w:sz w:val="24"/>
+        </w:rPr>
+        <w:t>PECHETTI DEVENDRA VENKATA SAI   : 24L65A5406</w:t>
+      </w:r>
+    </w:p>
+    <w:p>
+      <w:pPr>
+        <w:jc w:val="right"/>
+      </w:pPr>
+      <w:r>
+        <w:rPr>
+          <w:rFonts w:ascii="Times New Roman" w:hAnsi="Times New Roman"/>
+          <w:b/>
+          <w:sz w:val="24"/>
+        </w:rPr>
+        <w:t>MANTRI UMADEVI                  : 23L61A5425</w:t>
       </w:r>
     </w:p>
     <w:p>
@@ -667,171 +855,6 @@
           <w:docGrid w:linePitch="360"/>
         </w:sectPr>
       </w:pPr>
-    </w:p>
-    <w:p>
-      <w:pPr>
-        <w:pStyle w:val="Heading1"/>
-        <w:jc w:val="center"/>
-      </w:pPr>
-      <w:r>
-        <w:rPr>
-          <w:color w:val="000000"/>
-        </w:rPr>
-        <w:t>ACKNOWLEDGEMENT</w:t>
-      </w:r>
-    </w:p>
-    <w:p/>
-    <w:p>
-      <w:pPr>
-        <w:spacing w:line="360" w:lineRule="auto"/>
-        <w:jc w:val="both"/>
-      </w:pPr>
-      <w:r>
-        <w:rPr>
-          <w:rFonts w:ascii="Times New Roman" w:hAnsi="Times New Roman"/>
-          <w:b w:val="0"/>
-          <w:sz w:val="24"/>
-        </w:rPr>
-        <w:t>With great solemnity and sincerity, we express our deepest sense of gratitude and pay our sincere thanks to our Project guide Mrs. P. Gayatri, Assistant Professor, Department of Artificial Intelligence and Data Science, Chaitanya Engineering College, who evinced keen interest in our efforts and provided her invaluable guidance throughout our project work. Her constant encouragement, constructive feedback, and patient mentorship were fundamental to the success of this project.</w:t>
-      </w:r>
-    </w:p>
-    <w:p/>
-    <w:p>
-      <w:pPr>
-        <w:spacing w:line="360" w:lineRule="auto"/>
-        <w:jc w:val="both"/>
-      </w:pPr>
-      <w:r>
-        <w:rPr>
-          <w:rFonts w:ascii="Times New Roman" w:hAnsi="Times New Roman"/>
-          <w:b w:val="0"/>
-          <w:sz w:val="24"/>
-        </w:rPr>
-        <w:t>We thank our Dr. K.N.S Lakshmi, Professor, Head of the Department of CSE-Artificial Intelligence, who helped us to complete our project work in a truthful and systematic manner, and who consistently motivated us to aim for technical excellence.</w:t>
-      </w:r>
-    </w:p>
-    <w:p/>
-    <w:p>
-      <w:pPr>
-        <w:spacing w:line="360" w:lineRule="auto"/>
-        <w:jc w:val="both"/>
-      </w:pPr>
-      <w:r>
-        <w:rPr>
-          <w:rFonts w:ascii="Times New Roman" w:hAnsi="Times New Roman"/>
-          <w:b w:val="0"/>
-          <w:sz w:val="24"/>
-        </w:rPr>
-        <w:t>We extend our sincere gratitude to our principal Dr. K. Suresh, Ph.D., for his kind attention and valuable guidance throughout this academic programme. His leadership has created an environment of innovation and research that has greatly benefited our project work.</w:t>
-      </w:r>
-    </w:p>
-    <w:p/>
-    <w:p>
-      <w:pPr>
-        <w:spacing w:line="360" w:lineRule="auto"/>
-        <w:jc w:val="both"/>
-      </w:pPr>
-      <w:r>
-        <w:rPr>
-          <w:rFonts w:ascii="Times New Roman" w:hAnsi="Times New Roman"/>
-          <w:b w:val="0"/>
-          <w:sz w:val="24"/>
-        </w:rPr>
-        <w:t>We wish to express gratitude to our Management Members who supported us by providing excellent laboratory infrastructure and facilities, without which the practical implementation of this project would not have been possible.</w:t>
-      </w:r>
-    </w:p>
-    <w:p/>
-    <w:p>
-      <w:pPr>
-        <w:spacing w:line="360" w:lineRule="auto"/>
-        <w:jc w:val="both"/>
-      </w:pPr>
-      <w:r>
-        <w:rPr>
-          <w:rFonts w:ascii="Times New Roman" w:hAnsi="Times New Roman"/>
-          <w:b w:val="0"/>
-          <w:sz w:val="24"/>
-        </w:rPr>
-        <w:t>We are also deeply thankful to All Staff Members of the Department of Artificial Intelligence and Data Science, for their direct and indirect support in completing this project work through their valuable suggestions and technical guidance.</w:t>
-      </w:r>
-    </w:p>
-    <w:p/>
-    <w:p>
-      <w:pPr>
-        <w:spacing w:line="360" w:lineRule="auto"/>
-        <w:jc w:val="both"/>
-      </w:pPr>
-      <w:r>
-        <w:rPr>
-          <w:rFonts w:ascii="Times New Roman" w:hAnsi="Times New Roman"/>
-          <w:b w:val="0"/>
-          <w:sz w:val="24"/>
-        </w:rPr>
-        <w:t>Above all, we acknowledge our profound gratitude to our parents and families, whose moral support, encouragement, and sacrifices have been the greatest driving force throughout our academic journey. This work is a testament to their unwavering belief in us.</w:t>
-      </w:r>
-    </w:p>
-    <w:p/>
-    <w:p/>
-    <w:p>
-      <w:pPr>
-        <w:spacing w:line="360" w:lineRule="auto"/>
-        <w:jc w:val="center"/>
-      </w:pPr>
-      <w:r>
-        <w:rPr>
-          <w:rFonts w:ascii="Times New Roman" w:hAnsi="Times New Roman"/>
-          <w:b w:val="0"/>
-          <w:sz w:val="24"/>
-        </w:rPr>
-        <w:t>GUDABANDI NITHIN KUMAR           : 23L61A5418</w:t>
-      </w:r>
-    </w:p>
-    <w:p>
-      <w:pPr>
-        <w:spacing w:line="360" w:lineRule="auto"/>
-        <w:jc w:val="center"/>
-      </w:pPr>
-      <w:r>
-        <w:rPr>
-          <w:rFonts w:ascii="Times New Roman" w:hAnsi="Times New Roman"/>
-          <w:b w:val="0"/>
-          <w:sz w:val="24"/>
-        </w:rPr>
-        <w:t>BURAVELLI PARDHASARADHI          : 23L61A5408</w:t>
-      </w:r>
-    </w:p>
-    <w:p>
-      <w:pPr>
-        <w:spacing w:line="360" w:lineRule="auto"/>
-        <w:jc w:val="center"/>
-      </w:pPr>
-      <w:r>
-        <w:rPr>
-          <w:rFonts w:ascii="Times New Roman" w:hAnsi="Times New Roman"/>
-          <w:b w:val="0"/>
-          <w:sz w:val="24"/>
-        </w:rPr>
-        <w:t>PECHETTI DEVENDRA VENKATA SAI    : 24L65A5406</w:t>
-      </w:r>
-    </w:p>
-    <w:p>
-      <w:pPr>
-        <w:spacing w:line="360" w:lineRule="auto"/>
-        <w:jc w:val="center"/>
-      </w:pPr>
-      <w:r>
-        <w:rPr>
-          <w:rFonts w:ascii="Times New Roman" w:hAnsi="Times New Roman"/>
-          <w:b w:val="0"/>
-          <w:sz w:val="24"/>
-        </w:rPr>
-        <w:t>MANTRI UMADEVI                   : 23L61A5425</w:t>
-      </w:r>
-    </w:p>
-    <w:p>
-      <w:r>
-        <w:br w:type="page"/>
-      </w:r>
     </w:p>
     <w:p>
       <w:pPr>
@@ -6912,7 +6935,7 @@
         <w:drawing>
           <wp:inline xmlns:a="http://schemas.openxmlformats.org/drawingml/2006/main" xmlns:pic="http://schemas.openxmlformats.org/drawingml/2006/picture">
             <wp:extent cx="5303520" cy="4412172"/>
-            <wp:docPr id="2" name="Picture 2"/>
+            <wp:docPr id="3" name="Picture 3"/>
             <wp:cNvGraphicFramePr>
               <a:graphicFrameLocks noChangeAspect="1"/>
             </wp:cNvGraphicFramePr>
@@ -7063,7 +7086,7 @@
         <w:drawing>
           <wp:inline xmlns:a="http://schemas.openxmlformats.org/drawingml/2006/main" xmlns:pic="http://schemas.openxmlformats.org/drawingml/2006/picture">
             <wp:extent cx="5303520" cy="3659018"/>
-            <wp:docPr id="3" name="Picture 3"/>
+            <wp:docPr id="4" name="Picture 4"/>
             <wp:cNvGraphicFramePr>
               <a:graphicFrameLocks noChangeAspect="1"/>
             </wp:cNvGraphicFramePr>
@@ -7270,7 +7293,7 @@
         <w:drawing>
           <wp:inline xmlns:a="http://schemas.openxmlformats.org/drawingml/2006/main" xmlns:pic="http://schemas.openxmlformats.org/drawingml/2006/picture">
             <wp:extent cx="4114800" cy="3476847"/>
-            <wp:docPr id="4" name="Picture 4"/>
+            <wp:docPr id="5" name="Picture 5"/>
             <wp:cNvGraphicFramePr>
               <a:graphicFrameLocks noChangeAspect="1"/>
             </wp:cNvGraphicFramePr>
@@ -7407,7 +7430,7 @@
         <w:drawing>
           <wp:inline xmlns:a="http://schemas.openxmlformats.org/drawingml/2006/main" xmlns:pic="http://schemas.openxmlformats.org/drawingml/2006/picture">
             <wp:extent cx="5303520" cy="4070143"/>
-            <wp:docPr id="5" name="Picture 5"/>
+            <wp:docPr id="6" name="Picture 6"/>
             <wp:cNvGraphicFramePr>
               <a:graphicFrameLocks noChangeAspect="1"/>
             </wp:cNvGraphicFramePr>
@@ -8006,7 +8029,7 @@
         <w:drawing>
           <wp:inline xmlns:a="http://schemas.openxmlformats.org/drawingml/2006/main" xmlns:pic="http://schemas.openxmlformats.org/drawingml/2006/picture">
             <wp:extent cx="5029200" cy="2540794"/>
-            <wp:docPr id="6" name="Picture 6"/>
+            <wp:docPr id="7" name="Picture 7"/>
             <wp:cNvGraphicFramePr>
               <a:graphicFrameLocks noChangeAspect="1"/>
             </wp:cNvGraphicFramePr>
@@ -8059,7 +8082,7 @@
         <w:drawing>
           <wp:inline xmlns:a="http://schemas.openxmlformats.org/drawingml/2006/main" xmlns:pic="http://schemas.openxmlformats.org/drawingml/2006/picture">
             <wp:extent cx="5029200" cy="2540794"/>
-            <wp:docPr id="7" name="Picture 7"/>
+            <wp:docPr id="8" name="Picture 8"/>
             <wp:cNvGraphicFramePr>
               <a:graphicFrameLocks noChangeAspect="1"/>
             </wp:cNvGraphicFramePr>
@@ -8112,7 +8135,7 @@
         <w:drawing>
           <wp:inline xmlns:a="http://schemas.openxmlformats.org/drawingml/2006/main" xmlns:pic="http://schemas.openxmlformats.org/drawingml/2006/picture">
             <wp:extent cx="5029200" cy="2540794"/>
-            <wp:docPr id="8" name="Picture 8"/>
+            <wp:docPr id="9" name="Picture 9"/>
             <wp:cNvGraphicFramePr>
               <a:graphicFrameLocks noChangeAspect="1"/>
             </wp:cNvGraphicFramePr>
@@ -8165,7 +8188,7 @@
         <w:drawing>
           <wp:inline xmlns:a="http://schemas.openxmlformats.org/drawingml/2006/main" xmlns:pic="http://schemas.openxmlformats.org/drawingml/2006/picture">
             <wp:extent cx="5029200" cy="2540794"/>
-            <wp:docPr id="9" name="Picture 9"/>
+            <wp:docPr id="10" name="Picture 10"/>
             <wp:cNvGraphicFramePr>
               <a:graphicFrameLocks noChangeAspect="1"/>
             </wp:cNvGraphicFramePr>
@@ -8244,7 +8267,7 @@
         <w:drawing>
           <wp:inline xmlns:a="http://schemas.openxmlformats.org/drawingml/2006/main" xmlns:pic="http://schemas.openxmlformats.org/drawingml/2006/picture">
             <wp:extent cx="5029200" cy="2540794"/>
-            <wp:docPr id="10" name="Picture 10"/>
+            <wp:docPr id="11" name="Picture 11"/>
             <wp:cNvGraphicFramePr>
               <a:graphicFrameLocks noChangeAspect="1"/>
             </wp:cNvGraphicFramePr>
@@ -8297,7 +8320,7 @@
         <w:drawing>
           <wp:inline xmlns:a="http://schemas.openxmlformats.org/drawingml/2006/main" xmlns:pic="http://schemas.openxmlformats.org/drawingml/2006/picture">
             <wp:extent cx="5029200" cy="2540794"/>
-            <wp:docPr id="11" name="Picture 11"/>
+            <wp:docPr id="12" name="Picture 12"/>
             <wp:cNvGraphicFramePr>
               <a:graphicFrameLocks noChangeAspect="1"/>
             </wp:cNvGraphicFramePr>
@@ -8350,7 +8373,7 @@
         <w:drawing>
           <wp:inline xmlns:a="http://schemas.openxmlformats.org/drawingml/2006/main" xmlns:pic="http://schemas.openxmlformats.org/drawingml/2006/picture">
             <wp:extent cx="5029200" cy="2540794"/>
-            <wp:docPr id="12" name="Picture 12"/>
+            <wp:docPr id="13" name="Picture 13"/>
             <wp:cNvGraphicFramePr>
               <a:graphicFrameLocks noChangeAspect="1"/>
             </wp:cNvGraphicFramePr>
@@ -8403,7 +8426,7 @@
         <w:drawing>
           <wp:inline xmlns:a="http://schemas.openxmlformats.org/drawingml/2006/main" xmlns:pic="http://schemas.openxmlformats.org/drawingml/2006/picture">
             <wp:extent cx="5029200" cy="2540794"/>
-            <wp:docPr id="13" name="Picture 13"/>
+            <wp:docPr id="14" name="Picture 14"/>
             <wp:cNvGraphicFramePr>
               <a:graphicFrameLocks noChangeAspect="1"/>
             </wp:cNvGraphicFramePr>

</xml_diff>

<commit_message>
Fix page overflow: trim sep() calls and reduce logo sizes, 1.5 spacing only in chapter body
</commit_message>
<xml_diff>
--- a/book/Zenthiqa_Project_Book.docx
+++ b/book/Zenthiqa_Project_Book.docx
@@ -2,11 +2,13 @@
 <file path=word/document.xml><?xml version="1.0" encoding="utf-8"?>
 <w:document xmlns:wpc="http://schemas.microsoft.com/office/word/2010/wordprocessingCanvas" xmlns:mo="http://schemas.microsoft.com/office/mac/office/2008/main" xmlns:mc="http://schemas.openxmlformats.org/markup-compatibility/2006" xmlns:mv="urn:schemas-microsoft-com:mac:vml" xmlns:o="urn:schemas-microsoft-com:office:office" xmlns:r="http://schemas.openxmlformats.org/officeDocument/2006/relationships" xmlns:m="http://schemas.openxmlformats.org/officeDocument/2006/math" xmlns:v="urn:schemas-microsoft-com:vml" xmlns:wp14="http://schemas.microsoft.com/office/word/2010/wordprocessingDrawing" xmlns:wp="http://schemas.openxmlformats.org/drawingml/2006/wordprocessingDrawing" xmlns:w10="urn:schemas-microsoft-com:office:word" xmlns:w="http://schemas.openxmlformats.org/wordprocessingml/2006/main" xmlns:w14="http://schemas.microsoft.com/office/word/2010/wordml" xmlns:wpg="http://schemas.microsoft.com/office/word/2010/wordprocessingGroup" xmlns:wpi="http://schemas.microsoft.com/office/word/2010/wordprocessingInk" xmlns:wne="http://schemas.microsoft.com/office/word/2006/wordml" xmlns:wps="http://schemas.microsoft.com/office/word/2010/wordprocessingShape" mc:Ignorable="w14 wp14">
   <w:body>
-    <w:p/>
-    <w:p/>
-    <w:p>
-      <w:pPr>
-        <w:spacing w:line="360" w:lineRule="auto"/>
+    <w:p>
+      <w:pPr>
+        <w:spacing w:before="0" w:after="0"/>
+      </w:pPr>
+    </w:p>
+    <w:p>
+      <w:pPr>
         <w:jc w:val="center"/>
       </w:pPr>
       <w:r>
@@ -21,10 +23,13 @@
         <w:t>E-COMMERCE CUSTOMER ANALYTICS</w:t>
       </w:r>
     </w:p>
-    <w:p/>
-    <w:p>
-      <w:pPr>
-        <w:spacing w:line="360" w:lineRule="auto"/>
+    <w:p>
+      <w:pPr>
+        <w:spacing w:before="0" w:after="0"/>
+      </w:pPr>
+    </w:p>
+    <w:p>
+      <w:pPr>
         <w:jc w:val="center"/>
       </w:pPr>
       <w:r>
@@ -38,7 +43,6 @@
     </w:p>
     <w:p>
       <w:pPr>
-        <w:spacing w:line="360" w:lineRule="auto"/>
         <w:jc w:val="center"/>
       </w:pPr>
       <w:r>
@@ -50,10 +54,13 @@
         <w:t>the degree of</w:t>
       </w:r>
     </w:p>
-    <w:p/>
-    <w:p>
-      <w:pPr>
-        <w:spacing w:line="360" w:lineRule="auto"/>
+    <w:p>
+      <w:pPr>
+        <w:spacing w:before="0" w:after="0"/>
+      </w:pPr>
+    </w:p>
+    <w:p>
+      <w:pPr>
         <w:jc w:val="center"/>
       </w:pPr>
       <w:r>
@@ -67,7 +74,6 @@
     </w:p>
     <w:p>
       <w:pPr>
-        <w:spacing w:line="360" w:lineRule="auto"/>
         <w:jc w:val="center"/>
       </w:pPr>
       <w:r>
@@ -81,7 +87,6 @@
     </w:p>
     <w:p>
       <w:pPr>
-        <w:spacing w:line="360" w:lineRule="auto"/>
         <w:jc w:val="center"/>
       </w:pPr>
       <w:r>
@@ -94,10 +99,13 @@
         <w:t>ARTIFICIAL INTELLIGENCE AND DATA SCIENCE</w:t>
       </w:r>
     </w:p>
-    <w:p/>
-    <w:p>
-      <w:pPr>
-        <w:spacing w:line="360" w:lineRule="auto"/>
+    <w:p>
+      <w:pPr>
+        <w:spacing w:before="0" w:after="0"/>
+      </w:pPr>
+    </w:p>
+    <w:p>
+      <w:pPr>
         <w:jc w:val="center"/>
       </w:pPr>
       <w:r>
@@ -109,10 +117,8 @@
         <w:t>Submitted by</w:t>
       </w:r>
     </w:p>
-    <w:p/>
-    <w:p>
-      <w:pPr>
-        <w:spacing w:line="360" w:lineRule="auto"/>
+    <w:p>
+      <w:pPr>
         <w:jc w:val="center"/>
       </w:pPr>
       <w:r>
@@ -126,7 +132,6 @@
     </w:p>
     <w:p>
       <w:pPr>
-        <w:spacing w:line="360" w:lineRule="auto"/>
         <w:jc w:val="center"/>
       </w:pPr>
       <w:r>
@@ -140,7 +145,6 @@
     </w:p>
     <w:p>
       <w:pPr>
-        <w:spacing w:line="360" w:lineRule="auto"/>
         <w:jc w:val="center"/>
       </w:pPr>
       <w:r>
@@ -154,7 +158,6 @@
     </w:p>
     <w:p>
       <w:pPr>
-        <w:spacing w:line="360" w:lineRule="auto"/>
         <w:jc w:val="center"/>
       </w:pPr>
       <w:r>
@@ -166,10 +169,13 @@
         <w:t>MANTRI UMADEVI                  : 23L61A5425</w:t>
       </w:r>
     </w:p>
-    <w:p/>
-    <w:p>
-      <w:pPr>
-        <w:spacing w:line="360" w:lineRule="auto"/>
+    <w:p>
+      <w:pPr>
+        <w:spacing w:before="0" w:after="0"/>
+      </w:pPr>
+    </w:p>
+    <w:p>
+      <w:pPr>
         <w:jc w:val="center"/>
       </w:pPr>
       <w:r>
@@ -183,7 +189,6 @@
     </w:p>
     <w:p>
       <w:pPr>
-        <w:spacing w:line="360" w:lineRule="auto"/>
         <w:jc w:val="center"/>
       </w:pPr>
       <w:r>
@@ -197,7 +202,6 @@
     </w:p>
     <w:p>
       <w:pPr>
-        <w:spacing w:line="360" w:lineRule="auto"/>
         <w:jc w:val="center"/>
       </w:pPr>
       <w:r>
@@ -206,24 +210,148 @@
           <w:b w:val="0"/>
           <w:sz w:val="22"/>
         </w:rPr>
-        <w:t>Assistant Professor,</w:t>
-      </w:r>
-    </w:p>
-    <w:p>
-      <w:pPr>
-        <w:spacing w:line="360" w:lineRule="auto"/>
+        <w:t>Assistant Professor, Department of AI &amp; DS</w:t>
+      </w:r>
+    </w:p>
+    <w:p>
+      <w:pPr>
+        <w:spacing w:before="0" w:after="0"/>
+      </w:pPr>
+    </w:p>
+    <w:p>
+      <w:pPr>
+        <w:jc w:val="center"/>
+      </w:pPr>
+      <w:r>
+        <w:drawing>
+          <wp:inline xmlns:a="http://schemas.openxmlformats.org/drawingml/2006/main" xmlns:pic="http://schemas.openxmlformats.org/drawingml/2006/picture">
+            <wp:extent cx="1463040" cy="1463040"/>
+            <wp:docPr id="1" name="Picture 1"/>
+            <wp:cNvGraphicFramePr>
+              <a:graphicFrameLocks noChangeAspect="1"/>
+            </wp:cNvGraphicFramePr>
+            <a:graphic>
+              <a:graphicData uri="http://schemas.openxmlformats.org/drawingml/2006/picture">
+                <pic:pic>
+                  <pic:nvPicPr>
+                    <pic:cNvPr id="0" name="college_logo.jpg"/>
+                    <pic:cNvPicPr/>
+                  </pic:nvPicPr>
+                  <pic:blipFill>
+                    <a:blip r:embed="rId9"/>
+                    <a:stretch>
+                      <a:fillRect/>
+                    </a:stretch>
+                  </pic:blipFill>
+                  <pic:spPr>
+                    <a:xfrm>
+                      <a:off x="0" y="0"/>
+                      <a:ext cx="1463040" cy="1463040"/>
+                    </a:xfrm>
+                    <a:prstGeom prst="rect"/>
+                  </pic:spPr>
+                </pic:pic>
+              </a:graphicData>
+            </a:graphic>
+          </wp:inline>
+        </w:drawing>
+      </w:r>
+    </w:p>
+    <w:p>
+      <w:pPr>
+        <w:spacing w:before="0" w:after="0"/>
+      </w:pPr>
+    </w:p>
+    <w:p>
+      <w:pPr>
+        <w:jc w:val="center"/>
+      </w:pPr>
+      <w:r>
+        <w:rPr>
+          <w:rFonts w:ascii="Times New Roman" w:hAnsi="Times New Roman"/>
+          <w:b/>
+          <w:color w:val="0000CC"/>
+          <w:sz w:val="24"/>
+        </w:rPr>
+        <w:t>DEPARTMENT OF ARTIFICIAL INTELLIGENCE AND DATA SCIENCE</w:t>
+      </w:r>
+    </w:p>
+    <w:p>
+      <w:pPr>
+        <w:jc w:val="center"/>
+      </w:pPr>
+      <w:r>
+        <w:rPr>
+          <w:rFonts w:ascii="Times New Roman" w:hAnsi="Times New Roman"/>
+          <w:b/>
+          <w:color w:val="0000CC"/>
+          <w:sz w:val="24"/>
+        </w:rPr>
+        <w:t>CHAITANYA ENGINEERING COLLEGE</w:t>
+      </w:r>
+    </w:p>
+    <w:p>
+      <w:pPr>
         <w:jc w:val="center"/>
       </w:pPr>
       <w:r>
         <w:rPr>
           <w:rFonts w:ascii="Times New Roman" w:hAnsi="Times New Roman"/>
           <w:b w:val="0"/>
-          <w:sz w:val="22"/>
-        </w:rPr>
-        <w:t>Department of AI &amp; DS</w:t>
-      </w:r>
-    </w:p>
-    <w:p/>
+          <w:sz w:val="20"/>
+        </w:rPr>
+        <w:t>(APPROVED BY AICTE &amp; AFFILIATED TO JNTU GURAJADA, VIZIANAGARAM)</w:t>
+      </w:r>
+    </w:p>
+    <w:p>
+      <w:pPr>
+        <w:jc w:val="center"/>
+      </w:pPr>
+      <w:r>
+        <w:rPr>
+          <w:rFonts w:ascii="Times New Roman" w:hAnsi="Times New Roman"/>
+          <w:b/>
+          <w:sz w:val="24"/>
+        </w:rPr>
+        <w:t>2026 – 2027</w:t>
+      </w:r>
+    </w:p>
+    <w:p>
+      <w:r>
+        <w:br w:type="page"/>
+      </w:r>
+    </w:p>
+    <w:p>
+      <w:pPr>
+        <w:jc w:val="center"/>
+      </w:pPr>
+      <w:r>
+        <w:rPr>
+          <w:rFonts w:ascii="Times New Roman" w:hAnsi="Times New Roman"/>
+          <w:b/>
+          <w:sz w:val="26"/>
+        </w:rPr>
+        <w:t>CHAITANYA ENGINEERING COLLEGE</w:t>
+      </w:r>
+    </w:p>
+    <w:p>
+      <w:pPr>
+        <w:jc w:val="center"/>
+      </w:pPr>
+      <w:r>
+        <w:rPr>
+          <w:rFonts w:ascii="Times New Roman" w:hAnsi="Times New Roman"/>
+          <w:b w:val="0"/>
+          <w:sz w:val="20"/>
+        </w:rPr>
+        <w:t>(Approved by AICTE, Affiliated to JNTU GURAJADA, VIZIANAGARAM)</w:t>
+      </w:r>
+    </w:p>
+    <w:p>
+      <w:pPr>
+        <w:spacing w:before="0" w:after="0"/>
+      </w:pPr>
+    </w:p>
     <w:p>
       <w:pPr>
         <w:jc w:val="center"/>
@@ -232,7 +360,7 @@
         <w:drawing>
           <wp:inline xmlns:a="http://schemas.openxmlformats.org/drawingml/2006/main" xmlns:pic="http://schemas.openxmlformats.org/drawingml/2006/picture">
             <wp:extent cx="1645920" cy="1645920"/>
-            <wp:docPr id="1" name="Picture 1"/>
+            <wp:docPr id="2" name="Picture 2"/>
             <wp:cNvGraphicFramePr>
               <a:graphicFrameLocks noChangeAspect="1"/>
             </wp:cNvGraphicFramePr>
@@ -263,143 +391,13 @@
         </w:drawing>
       </w:r>
     </w:p>
-    <w:p/>
-    <w:p>
-      <w:pPr>
-        <w:spacing w:line="360" w:lineRule="auto"/>
-        <w:jc w:val="center"/>
-      </w:pPr>
-      <w:r>
-        <w:rPr>
-          <w:rFonts w:ascii="Times New Roman" w:hAnsi="Times New Roman"/>
-          <w:b/>
-          <w:color w:val="0000CC"/>
-          <w:sz w:val="26"/>
-        </w:rPr>
-        <w:t>DEPARTMENT OF ARTIFICIAL INTELLIGENCE AND DATA SCIENCE</w:t>
-      </w:r>
-    </w:p>
-    <w:p>
-      <w:pPr>
-        <w:spacing w:line="360" w:lineRule="auto"/>
-        <w:jc w:val="center"/>
-      </w:pPr>
-      <w:r>
-        <w:rPr>
-          <w:rFonts w:ascii="Times New Roman" w:hAnsi="Times New Roman"/>
-          <w:b/>
-          <w:color w:val="0000CC"/>
-          <w:sz w:val="26"/>
-        </w:rPr>
-        <w:t>CHAITANYA ENGINEERING COLLEGE</w:t>
-      </w:r>
-    </w:p>
-    <w:p>
-      <w:pPr>
-        <w:spacing w:line="360" w:lineRule="auto"/>
-        <w:jc w:val="center"/>
-      </w:pPr>
-      <w:r>
-        <w:rPr>
-          <w:rFonts w:ascii="Times New Roman" w:hAnsi="Times New Roman"/>
-          <w:b w:val="0"/>
-          <w:sz w:val="20"/>
-        </w:rPr>
-        <w:t>(APPROVED BY AICTE &amp; AFFILIATED TO JNTU GURAJADA, VIZIANAGARAM)</w:t>
-      </w:r>
-    </w:p>
-    <w:p/>
-    <w:p>
-      <w:pPr>
-        <w:spacing w:line="360" w:lineRule="auto"/>
-        <w:jc w:val="center"/>
-      </w:pPr>
-      <w:r>
-        <w:rPr>
-          <w:rFonts w:ascii="Times New Roman" w:hAnsi="Times New Roman"/>
-          <w:b/>
-          <w:sz w:val="24"/>
-        </w:rPr>
-        <w:t>2026 – 2027</w:t>
-      </w:r>
-    </w:p>
-    <w:p>
-      <w:r>
-        <w:br w:type="page"/>
-      </w:r>
-    </w:p>
-    <w:p>
-      <w:pPr>
-        <w:spacing w:line="360" w:lineRule="auto"/>
-        <w:jc w:val="center"/>
-      </w:pPr>
-      <w:r>
-        <w:rPr>
-          <w:rFonts w:ascii="Times New Roman" w:hAnsi="Times New Roman"/>
-          <w:b/>
-          <w:sz w:val="26"/>
-        </w:rPr>
-        <w:t>CHAITANYA ENGINEERING COLLEGE</w:t>
-      </w:r>
-    </w:p>
-    <w:p>
-      <w:pPr>
-        <w:spacing w:line="360" w:lineRule="auto"/>
-        <w:jc w:val="center"/>
-      </w:pPr>
-      <w:r>
-        <w:rPr>
-          <w:rFonts w:ascii="Times New Roman" w:hAnsi="Times New Roman"/>
-          <w:b w:val="0"/>
-          <w:sz w:val="20"/>
-        </w:rPr>
-        <w:t>(Approved by AICTE, Affiliated to JNTU GURAJADA, VIZIANAGARAM)</w:t>
-      </w:r>
-    </w:p>
-    <w:p/>
-    <w:p>
-      <w:pPr>
-        <w:jc w:val="center"/>
-      </w:pPr>
-      <w:r>
-        <w:drawing>
-          <wp:inline xmlns:a="http://schemas.openxmlformats.org/drawingml/2006/main" xmlns:pic="http://schemas.openxmlformats.org/drawingml/2006/picture">
-            <wp:extent cx="2011680" cy="2011680"/>
-            <wp:docPr id="2" name="Picture 2"/>
-            <wp:cNvGraphicFramePr>
-              <a:graphicFrameLocks noChangeAspect="1"/>
-            </wp:cNvGraphicFramePr>
-            <a:graphic>
-              <a:graphicData uri="http://schemas.openxmlformats.org/drawingml/2006/picture">
-                <pic:pic>
-                  <pic:nvPicPr>
-                    <pic:cNvPr id="0" name="college_logo.jpg"/>
-                    <pic:cNvPicPr/>
-                  </pic:nvPicPr>
-                  <pic:blipFill>
-                    <a:blip r:embed="rId9"/>
-                    <a:stretch>
-                      <a:fillRect/>
-                    </a:stretch>
-                  </pic:blipFill>
-                  <pic:spPr>
-                    <a:xfrm>
-                      <a:off x="0" y="0"/>
-                      <a:ext cx="2011680" cy="2011680"/>
-                    </a:xfrm>
-                    <a:prstGeom prst="rect"/>
-                  </pic:spPr>
-                </pic:pic>
-              </a:graphicData>
-            </a:graphic>
-          </wp:inline>
-        </w:drawing>
-      </w:r>
-    </w:p>
-    <w:p/>
-    <w:p>
-      <w:pPr>
-        <w:spacing w:line="360" w:lineRule="auto"/>
+    <w:p>
+      <w:pPr>
+        <w:spacing w:before="0" w:after="0"/>
+      </w:pPr>
+    </w:p>
+    <w:p>
+      <w:pPr>
         <w:jc w:val="center"/>
       </w:pPr>
       <w:r>
@@ -411,10 +409,13 @@
         <w:t>BONAFIDE CERTIFICATE</w:t>
       </w:r>
     </w:p>
-    <w:p/>
-    <w:p>
-      <w:pPr>
-        <w:spacing w:line="360" w:lineRule="auto"/>
+    <w:p>
+      <w:pPr>
+        <w:spacing w:before="0" w:after="0"/>
+      </w:pPr>
+    </w:p>
+    <w:p>
+      <w:pPr>
         <w:jc w:val="both"/>
       </w:pPr>
       <w:r>
@@ -426,9 +427,16 @@
         <w:t>This is to certify that the project titled "ZENTHIQA: DEEP LEARNING MICROSERVICES FOR E-COMMERCE CUSTOMER ANALYTICS" is a Bonafide work carried out by G. Nithin Kumar (23L61A5418), B. Pardhasaradhi (23L61A5408), P. Devendra Venkata Sai (24L65A5406), M. Umadevi (23L61A5425) as part of the IV B.Tech, II Semester curriculum in Artificial Intelligence and Data Science during the academic year 2026–2027.</w:t>
       </w:r>
     </w:p>
-    <w:p/>
-    <w:p/>
-    <w:p/>
+    <w:p>
+      <w:pPr>
+        <w:spacing w:before="0" w:after="0"/>
+      </w:pPr>
+    </w:p>
+    <w:p>
+      <w:pPr>
+        <w:spacing w:before="0" w:after="0"/>
+      </w:pPr>
+    </w:p>
     <w:tbl>
       <w:tblPr>
         <w:tblStyle w:val="TableGrid"/>
@@ -564,8 +572,11 @@
         </w:tc>
       </w:tr>
     </w:tbl>
-    <w:p/>
-    <w:p/>
+    <w:p>
+      <w:pPr>
+        <w:spacing w:before="0" w:after="0"/>
+      </w:pPr>
+    </w:p>
     <w:p>
       <w:pPr>
         <w:jc w:val="left"/>
@@ -595,7 +606,6 @@
     </w:p>
     <w:p>
       <w:pPr>
-        <w:spacing w:line="360" w:lineRule="auto"/>
         <w:jc w:val="center"/>
       </w:pPr>
       <w:r>
@@ -607,10 +617,13 @@
         <w:t>DECLARATION</w:t>
       </w:r>
     </w:p>
-    <w:p/>
-    <w:p>
-      <w:pPr>
-        <w:spacing w:line="360" w:lineRule="auto"/>
+    <w:p>
+      <w:pPr>
+        <w:spacing w:before="0" w:after="0"/>
+      </w:pPr>
+    </w:p>
+    <w:p>
+      <w:pPr>
         <w:jc w:val="both"/>
       </w:pPr>
       <w:r>
@@ -622,9 +635,16 @@
         <w:t>We hereby declare that the project work titled "ZENTHIQA: DEEP LEARNING MICROSERVICES FOR E-COMMERCE CUSTOMER ANALYTICS" submitted to CHAITANYA ENGINEERING COLLEGE is a record of an original work done by G. Nithin Kumar (23L61A5418), B. Pardhasaradhi (23L61A5408), P. Devendra Venkata Sai (24L65A5406), M. Umadevi (23L61A5425) under the esteemed guidance of Mrs. P. Gayatri, Assistant Professor. This project work is submitted in the partial fulfilment of the requirements for the award of the degree Bachelor of Technology in Artificial Intelligence and Data Science. This entire project is done with the best of our knowledge and is not submitted to any University for the award of degree.</w:t>
       </w:r>
     </w:p>
-    <w:p/>
-    <w:p/>
-    <w:p/>
+    <w:p>
+      <w:pPr>
+        <w:spacing w:before="0" w:after="0"/>
+      </w:pPr>
+    </w:p>
+    <w:p>
+      <w:pPr>
+        <w:spacing w:before="0" w:after="0"/>
+      </w:pPr>
+    </w:p>
     <w:p>
       <w:pPr>
         <w:jc w:val="right"/>
@@ -684,7 +704,6 @@
     </w:p>
     <w:p>
       <w:pPr>
-        <w:spacing w:line="360" w:lineRule="auto"/>
         <w:jc w:val="center"/>
       </w:pPr>
       <w:r>
@@ -696,10 +715,13 @@
         <w:t>ACKNOWLEDGEMENT</w:t>
       </w:r>
     </w:p>
-    <w:p/>
-    <w:p>
-      <w:pPr>
-        <w:spacing w:line="360" w:lineRule="auto"/>
+    <w:p>
+      <w:pPr>
+        <w:spacing w:before="0" w:after="0"/>
+      </w:pPr>
+    </w:p>
+    <w:p>
+      <w:pPr>
         <w:jc w:val="both"/>
       </w:pPr>
       <w:r>
@@ -708,13 +730,11 @@
           <w:b w:val="0"/>
           <w:sz w:val="24"/>
         </w:rPr>
-        <w:t>With great solemnity and sincerity, we express our deepest sense of gratitude and pay our sincere thanks to our Project guide Mrs. P. Gayatri, Assistant Professor, Department of Artificial Intelligence and Data Science, Chaitanya Engineering College, who evinced keen interest in our efforts and provided her invaluable guidance throughout our project work. Her constant encouragement, constructive feedback, and patient mentorship were fundamental to the success of this project.</w:t>
-      </w:r>
-    </w:p>
-    <w:p/>
-    <w:p>
-      <w:pPr>
-        <w:spacing w:line="360" w:lineRule="auto"/>
+        <w:t>With great solemnity and sincerity, we express our deepest sense of gratitude and pay our sincere thanks to our Project guide Mrs. P. Gayatri, Assistant Professor, Department of Artificial Intelligence and Data Science, Chaitanya Engineering College, who evinced keen interest in our efforts and provided her invaluable guidance throughout our project work.</w:t>
+      </w:r>
+    </w:p>
+    <w:p>
+      <w:pPr>
         <w:jc w:val="both"/>
       </w:pPr>
       <w:r>
@@ -726,10 +746,8 @@
         <w:t>We thank our Dr. K.N.S Lakshmi, Professor, Head of the Department of Artificial Intelligence, who helped us to complete our project work in a truthful and systematic manner, and who consistently motivated us to aim for technical excellence.</w:t>
       </w:r>
     </w:p>
-    <w:p/>
-    <w:p>
-      <w:pPr>
-        <w:spacing w:line="360" w:lineRule="auto"/>
+    <w:p>
+      <w:pPr>
         <w:jc w:val="both"/>
       </w:pPr>
       <w:r>
@@ -738,13 +756,11 @@
           <w:b w:val="0"/>
           <w:sz w:val="24"/>
         </w:rPr>
-        <w:t>We extend our sincere gratitude to our principal Dr. K. Suresh, Ph.D., for his kind attention and valuable guidance throughout this academic programme. His leadership has created an environment of innovation and research that has greatly benefited our project work.</w:t>
-      </w:r>
-    </w:p>
-    <w:p/>
-    <w:p>
-      <w:pPr>
-        <w:spacing w:line="360" w:lineRule="auto"/>
+        <w:t>We extend our sincere gratitude to our principal Dr. K. Suresh, Ph.D., for his kind attention and valuable guidance throughout this academic programme. His leadership has created an environment of innovation and research that greatly benefited our project work.</w:t>
+      </w:r>
+    </w:p>
+    <w:p>
+      <w:pPr>
         <w:jc w:val="both"/>
       </w:pPr>
       <w:r>
@@ -756,10 +772,8 @@
         <w:t>We wish to express gratitude to our Management Members who supported us by providing excellent laboratory infrastructure and facilities, without which the practical implementation of this project would not have been possible.</w:t>
       </w:r>
     </w:p>
-    <w:p/>
-    <w:p>
-      <w:pPr>
-        <w:spacing w:line="360" w:lineRule="auto"/>
+    <w:p>
+      <w:pPr>
         <w:jc w:val="both"/>
       </w:pPr>
       <w:r>
@@ -771,10 +785,8 @@
         <w:t>We are also deeply thankful to All Staff Members of the Department of Artificial Intelligence and Data Science, for their direct and indirect support in completing this project work through their valuable suggestions and technical guidance.</w:t>
       </w:r>
     </w:p>
-    <w:p/>
-    <w:p>
-      <w:pPr>
-        <w:spacing w:line="360" w:lineRule="auto"/>
+    <w:p>
+      <w:pPr>
         <w:jc w:val="both"/>
       </w:pPr>
       <w:r>
@@ -786,8 +798,11 @@
         <w:t>Above all, we acknowledge our profound gratitude to our parents and families, whose moral support, encouragement, and sacrifices have been the greatest driving force throughout our academic journey.</w:t>
       </w:r>
     </w:p>
-    <w:p/>
-    <w:p/>
+    <w:p>
+      <w:pPr>
+        <w:spacing w:before="0" w:after="0"/>
+      </w:pPr>
+    </w:p>
     <w:p>
       <w:pPr>
         <w:jc w:val="right"/>
@@ -868,10 +883,13 @@
         <w:t>ABSTRACT</w:t>
       </w:r>
     </w:p>
-    <w:p/>
-    <w:p>
-      <w:pPr>
-        <w:spacing w:line="360" w:lineRule="auto"/>
+    <w:p>
+      <w:pPr>
+        <w:spacing w:before="0" w:after="0"/>
+      </w:pPr>
+    </w:p>
+    <w:p>
+      <w:pPr>
         <w:jc w:val="both"/>
       </w:pPr>
       <w:r>
@@ -883,10 +901,13 @@
         <w:t>The rapid expansion of the global e-commerce industry has led to an unprecedented accumulation of customer transactional data. Converting this raw data into strategic business intelligence, particularly the ability to predict future customer behavior, has become a key competitive advantage. Traditional analytical frameworks, such as the RFM (Recency, Frequency, Monetary) model, offer retrospective insights but fail to anticipate future customer actions, leaving businesses reactive rather than proactive.</w:t>
       </w:r>
     </w:p>
-    <w:p/>
-    <w:p>
-      <w:pPr>
-        <w:spacing w:line="360" w:lineRule="auto"/>
+    <w:p>
+      <w:pPr>
+        <w:spacing w:before="0" w:after="0"/>
+      </w:pPr>
+    </w:p>
+    <w:p>
+      <w:pPr>
         <w:jc w:val="both"/>
       </w:pPr>
       <w:r>
@@ -898,10 +919,13 @@
         <w:t>This project presents Zenthiqa, a comprehensive Deep Learning Microservice Platform for E-Commerce Customer Analytics. The core of the system is a Multi-Task Learning (MTL) neural network built using PyTorch, designed to simultaneously predict two highly correlated targets: Customer Lifetime Value (CLV), formulated as a regression problem, and Churn Risk, formulated as a binary classification problem. By sharing internal hidden-layer representations between these two tasks, the model captures the deep, non-linear relationship between a customer's spending trajectory and their risk of abandonment, achieving superior predictive accuracy over isolated single-task models.</w:t>
       </w:r>
     </w:p>
-    <w:p/>
-    <w:p>
-      <w:pPr>
-        <w:spacing w:line="360" w:lineRule="auto"/>
+    <w:p>
+      <w:pPr>
+        <w:spacing w:before="0" w:after="0"/>
+      </w:pPr>
+    </w:p>
+    <w:p>
+      <w:pPr>
         <w:jc w:val="both"/>
       </w:pPr>
       <w:r>
@@ -913,10 +937,13 @@
         <w:t>In addition to the MTL model, Zenthiqa integrates a Neural Collaborative Filtering (NCF) engine for personalized product recommendations, a SHAP-powered What-If Simulator that enables business stakeholders to explore hypothetical intervention scenarios in real time, and an AI-driven automated Win-Back Email generation system that produces personalized retention messages for at-risk customers.</w:t>
       </w:r>
     </w:p>
-    <w:p/>
-    <w:p>
-      <w:pPr>
-        <w:spacing w:line="360" w:lineRule="auto"/>
+    <w:p>
+      <w:pPr>
+        <w:spacing w:before="0" w:after="0"/>
+      </w:pPr>
+    </w:p>
+    <w:p>
+      <w:pPr>
         <w:jc w:val="both"/>
       </w:pPr>
       <w:r>
@@ -928,10 +955,13 @@
         <w:t>The system is built on a modern microservices architecture. The backend is implemented using FastAPI (Python), providing high-performance RESTful API endpoints. The frontend is built with Next.js (React) and TailwindCSS, delivering a highly responsive and interactive dashboard. The platform is deployed on Amazon Web Services (AWS), with the backend on EC2 and all model artifacts stored on S3, provisioned through Terraform.</w:t>
       </w:r>
     </w:p>
-    <w:p/>
-    <w:p>
-      <w:pPr>
-        <w:spacing w:line="360" w:lineRule="auto"/>
+    <w:p>
+      <w:pPr>
+        <w:spacing w:before="0" w:after="0"/>
+      </w:pPr>
+    </w:p>
+    <w:p>
+      <w:pPr>
         <w:jc w:val="both"/>
       </w:pPr>
       <w:r>
@@ -960,7 +990,11 @@
         <w:t>TABLE OF CONTENTS</w:t>
       </w:r>
     </w:p>
-    <w:p/>
+    <w:p>
+      <w:pPr>
+        <w:spacing w:before="0" w:after="0"/>
+      </w:pPr>
+    </w:p>
     <w:tbl>
       <w:tblPr>
         <w:tblW w:type="auto" w:w="0"/>
@@ -3699,7 +3733,11 @@
         <w:t>LIST OF FIGURES</w:t>
       </w:r>
     </w:p>
-    <w:p/>
+    <w:p>
+      <w:pPr>
+        <w:spacing w:before="0" w:after="0"/>
+      </w:pPr>
+    </w:p>
     <w:tbl>
       <w:tblPr>
         <w:tblW w:type="auto" w:w="0"/>
@@ -4145,7 +4183,6 @@
     </w:p>
     <w:p>
       <w:pPr>
-        <w:spacing w:line="360" w:lineRule="auto"/>
         <w:jc w:val="both"/>
       </w:pPr>
       <w:r>
@@ -4157,10 +4194,13 @@
         <w:t>The global e-commerce landscape has undergone a dramatic transformation over the past decade. Fueled by the proliferation of smartphones, widespread internet access, and evolving consumer preferences, online retail has grown into a multi-trillion-dollar industry. This growth has also intensified market competition, making customer acquisition and retention increasingly expensive and challenging. In such an environment, the ability to anticipate customer behavior, predicting who will buy, how much they will spend over their lifetime, and who is likely to stop engaging with the platform, constitutes a powerful strategic advantage.</w:t>
       </w:r>
     </w:p>
-    <w:p/>
-    <w:p>
-      <w:pPr>
-        <w:spacing w:line="360" w:lineRule="auto"/>
+    <w:p>
+      <w:pPr>
+        <w:spacing w:before="0" w:after="0"/>
+      </w:pPr>
+    </w:p>
+    <w:p>
+      <w:pPr>
         <w:jc w:val="both"/>
       </w:pPr>
       <w:r>
@@ -4172,10 +4212,13 @@
         <w:t>Businesses have historically used rule-based methods such as the RFM (Recency, Frequency, Monetary) model to segment and understand their customer base. RFM assigns scores based on how recently a customer made a purchase (Recency), how often they purchase (Frequency), and the total monetary value of their purchases (Monetary). While effective for historical segmentation, RFM provides no predictive capacity. It describes past behavior but cannot forecast future outcomes. A customer who has historically been high-value on the RFM scale may be silently drifting away, and a simple RFM analysis will not detect this deterioration until it is too late for an effective intervention.</w:t>
       </w:r>
     </w:p>
-    <w:p/>
-    <w:p>
-      <w:pPr>
-        <w:spacing w:line="360" w:lineRule="auto"/>
+    <w:p>
+      <w:pPr>
+        <w:spacing w:before="0" w:after="0"/>
+      </w:pPr>
+    </w:p>
+    <w:p>
+      <w:pPr>
         <w:jc w:val="both"/>
       </w:pPr>
       <w:r>
@@ -4201,7 +4244,6 @@
     </w:p>
     <w:p>
       <w:pPr>
-        <w:spacing w:line="360" w:lineRule="auto"/>
         <w:jc w:val="both"/>
       </w:pPr>
       <w:r>
@@ -4213,7 +4255,11 @@
         <w:t>The primary purpose of this project is to design, develop, and deploy a complete, production-ready AI analytics system for e-commerce businesses. The system is specifically purpose-built to solve three fundamental, interconnected business problems that together determine the long-term profitability of any customer relationship:</w:t>
       </w:r>
     </w:p>
-    <w:p/>
+    <w:p>
+      <w:pPr>
+        <w:spacing w:before="0" w:after="0"/>
+      </w:pPr>
+    </w:p>
     <w:p>
       <w:pPr>
         <w:pStyle w:val="ListBullet"/>
@@ -4256,10 +4302,13 @@
         <w:t>Personalized Product Recommendations: Based on a customer's historical interactions, which products are they most likely to purchase next? A strong recommendation engine improves average order value, cross-selling success rates, and overall user engagement.</w:t>
       </w:r>
     </w:p>
-    <w:p/>
-    <w:p>
-      <w:pPr>
-        <w:spacing w:line="360" w:lineRule="auto"/>
+    <w:p>
+      <w:pPr>
+        <w:spacing w:before="0" w:after="0"/>
+      </w:pPr>
+    </w:p>
+    <w:p>
+      <w:pPr>
         <w:jc w:val="both"/>
       </w:pPr>
       <w:r>
@@ -4285,7 +4334,6 @@
     </w:p>
     <w:p>
       <w:pPr>
-        <w:spacing w:line="360" w:lineRule="auto"/>
         <w:jc w:val="both"/>
       </w:pPr>
       <w:r>
@@ -4297,10 +4345,13 @@
         <w:t>Functional Scope: The system provides end-to-end analytical functionality from raw data processing to interactive visualization. It supports individual customer analytics (CLV, Churn, Recommendations), segment-level analytics via K-Means clustering on RFM features, batch-level processing for uploading and analyzing entire customer lists via CSV, automated AI-generated insights summaries, and personalized win-back email drafting.</w:t>
       </w:r>
     </w:p>
-    <w:p/>
-    <w:p>
-      <w:pPr>
-        <w:spacing w:line="360" w:lineRule="auto"/>
+    <w:p>
+      <w:pPr>
+        <w:spacing w:before="0" w:after="0"/>
+      </w:pPr>
+    </w:p>
+    <w:p>
+      <w:pPr>
         <w:jc w:val="both"/>
       </w:pPr>
       <w:r>
@@ -4312,10 +4363,13 @@
         <w:t>Technical Scope: The implementation covers data engineering (Parquet, preprocessing), machine learning (PyTorch MTL and NCF models, K-Means clustering, SHAP values), backend API development (FastAPI, Pydantic, CORS), and frontend development (Next.js, React, TailwindCSS, Recharts). Infrastructure provisioning via Terraform for AWS EC2 and S3 is also within scope.</w:t>
       </w:r>
     </w:p>
-    <w:p/>
-    <w:p>
-      <w:pPr>
-        <w:spacing w:line="360" w:lineRule="auto"/>
+    <w:p>
+      <w:pPr>
+        <w:spacing w:before="0" w:after="0"/>
+      </w:pPr>
+    </w:p>
+    <w:p>
+      <w:pPr>
         <w:jc w:val="both"/>
       </w:pPr>
       <w:r>
@@ -4341,7 +4395,6 @@
     </w:p>
     <w:p>
       <w:pPr>
-        <w:spacing w:line="360" w:lineRule="auto"/>
         <w:jc w:val="both"/>
       </w:pPr>
       <w:r>
@@ -4353,10 +4406,13 @@
         <w:t>The motivation for building Zenthiqa is rooted in two key realities of the modern e-commerce market. The first is the escalating cost of customer acquisition. Research by Bain and Company and Harvard Business School has found that acquiring a new customer can cost anywhere from five to twenty-five times more than retaining an existing one. Even a modest five percent increase in customer retention can lead to a twenty-five to ninety-five percent increase in profits. These figures underscore the immense financial value of a system that can accurately identify at-risk customers early enough for effective retention interventions.</w:t>
       </w:r>
     </w:p>
-    <w:p/>
-    <w:p>
-      <w:pPr>
-        <w:spacing w:line="360" w:lineRule="auto"/>
+    <w:p>
+      <w:pPr>
+        <w:spacing w:before="0" w:after="0"/>
+      </w:pPr>
+    </w:p>
+    <w:p>
+      <w:pPr>
         <w:jc w:val="both"/>
       </w:pPr>
       <w:r>
@@ -4382,7 +4438,6 @@
     </w:p>
     <w:p>
       <w:pPr>
-        <w:spacing w:line="360" w:lineRule="auto"/>
         <w:jc w:val="both"/>
       </w:pPr>
       <w:r>
@@ -4394,10 +4449,13 @@
         <w:t>The proposed system, Zenthiqa, is a multi-component, microservices-based analytics platform. Its architecture is deliberately separated into distinct, independently deployable layers, each responsible for a specific domain of functionality.</w:t>
       </w:r>
     </w:p>
-    <w:p/>
-    <w:p>
-      <w:pPr>
-        <w:spacing w:line="360" w:lineRule="auto"/>
+    <w:p>
+      <w:pPr>
+        <w:spacing w:before="0" w:after="0"/>
+      </w:pPr>
+    </w:p>
+    <w:p>
+      <w:pPr>
         <w:jc w:val="both"/>
       </w:pPr>
       <w:r>
@@ -4409,10 +4467,13 @@
         <w:t>At the data layer, the system ingests and processes the UCI Online Retail dataset containing over half a million purchase records. This data is cleaned and aggregated to derive per-customer RFM metrics, then serialized into Apache Parquet format and stored on AWS S3 for fast retrieval.</w:t>
       </w:r>
     </w:p>
-    <w:p/>
-    <w:p>
-      <w:pPr>
-        <w:spacing w:line="360" w:lineRule="auto"/>
+    <w:p>
+      <w:pPr>
+        <w:spacing w:before="0" w:after="0"/>
+      </w:pPr>
+    </w:p>
+    <w:p>
+      <w:pPr>
         <w:jc w:val="both"/>
       </w:pPr>
       <w:r>
@@ -4455,7 +4516,6 @@
     </w:p>
     <w:p>
       <w:pPr>
-        <w:spacing w:line="360" w:lineRule="auto"/>
         <w:jc w:val="both"/>
       </w:pPr>
       <w:r>
@@ -4493,7 +4553,6 @@
     </w:p>
     <w:p>
       <w:pPr>
-        <w:spacing w:line="360" w:lineRule="auto"/>
         <w:jc w:val="both"/>
       </w:pPr>
       <w:r>
@@ -4507,7 +4566,6 @@
     </w:p>
     <w:p>
       <w:pPr>
-        <w:spacing w:line="360" w:lineRule="auto"/>
         <w:jc w:val="both"/>
       </w:pPr>
       <w:r>
@@ -4519,10 +4577,13 @@
         <w:t>Title: 'Counting Your Customers' the Easy Way: An Alternative to the Pareto/NBD Model. Marketing Science, 2005.</w:t>
       </w:r>
     </w:p>
-    <w:p/>
-    <w:p>
-      <w:pPr>
-        <w:spacing w:line="360" w:lineRule="auto"/>
+    <w:p>
+      <w:pPr>
+        <w:spacing w:before="0" w:after="0"/>
+      </w:pPr>
+    </w:p>
+    <w:p>
+      <w:pPr>
         <w:jc w:val="both"/>
       </w:pPr>
       <w:r>
@@ -4534,7 +4595,11 @@
         <w:t>This foundational paper introduced the Beta-Geometric/Negative Binomial Distribution (BG/NBD) model, which became the standard probabilistic approach to CLV estimation for over a decade. The BG/NBD model treats the customer purchase process as a Poisson process with a Gamma-distributed rate and models customer dropout using a Beta-distributed probability. While significant, it has two fundamental limitations: it assumes a Poisson purchase distribution which may not reflect real-world burst purchasing behavior, and it is a univariate model. In contrast, Zenthiqa's MTL approach jointly models CLV alongside churn as correlated, multi-variate objectives, enabling richer, more accurate predictions.</w:t>
       </w:r>
     </w:p>
-    <w:p/>
+    <w:p>
+      <w:pPr>
+        <w:spacing w:before="0" w:after="0"/>
+      </w:pPr>
+    </w:p>
     <w:p>
       <w:pPr>
         <w:pStyle w:val="Heading3"/>
@@ -4549,7 +4614,6 @@
     </w:p>
     <w:p>
       <w:pPr>
-        <w:spacing w:line="360" w:lineRule="auto"/>
         <w:jc w:val="both"/>
       </w:pPr>
       <w:r>
@@ -4563,7 +4627,6 @@
     </w:p>
     <w:p>
       <w:pPr>
-        <w:spacing w:line="360" w:lineRule="auto"/>
         <w:jc w:val="both"/>
       </w:pPr>
       <w:r>
@@ -4575,10 +4638,13 @@
         <w:t>Title: New Insights into Churn Prediction in the Telecommunication Sector. European Journal of Operational Research, 2012.</w:t>
       </w:r>
     </w:p>
-    <w:p/>
-    <w:p>
-      <w:pPr>
-        <w:spacing w:line="360" w:lineRule="auto"/>
+    <w:p>
+      <w:pPr>
+        <w:spacing w:before="0" w:after="0"/>
+      </w:pPr>
+    </w:p>
+    <w:p>
+      <w:pPr>
         <w:jc w:val="both"/>
       </w:pPr>
       <w:r>
@@ -4590,7 +4656,11 @@
         <w:t>This paper surveyed and benchmarked a comprehensive set of machine learning algorithms including Logistic Regression, Decision Trees, Neural Networks, and Support Vector Machines for churn prediction. The study introduced a profit-driven evaluation framework, arguing that standard accuracy metrics fail to capture the business value of a churn model. Despite its comprehensive comparison, the paper studied single-task models exclusively, ignoring the possibility that simultaneously predicting CLV could improve churn prediction accuracy — as is the case in Zenthiqa's multi-task formulation.</w:t>
       </w:r>
     </w:p>
-    <w:p/>
+    <w:p>
+      <w:pPr>
+        <w:spacing w:before="0" w:after="0"/>
+      </w:pPr>
+    </w:p>
     <w:p>
       <w:pPr>
         <w:pStyle w:val="Heading3"/>
@@ -4605,7 +4675,6 @@
     </w:p>
     <w:p>
       <w:pPr>
-        <w:spacing w:line="360" w:lineRule="auto"/>
         <w:jc w:val="both"/>
       </w:pPr>
       <w:r>
@@ -4619,7 +4688,6 @@
     </w:p>
     <w:p>
       <w:pPr>
-        <w:spacing w:line="360" w:lineRule="auto"/>
         <w:jc w:val="both"/>
       </w:pPr>
       <w:r>
@@ -4631,10 +4699,13 @@
         <w:t>Title: Matrix Factorization Techniques for Recommender Systems. IEEE Computer, 2009.</w:t>
       </w:r>
     </w:p>
-    <w:p/>
-    <w:p>
-      <w:pPr>
-        <w:spacing w:line="360" w:lineRule="auto"/>
+    <w:p>
+      <w:pPr>
+        <w:spacing w:before="0" w:after="0"/>
+      </w:pPr>
+    </w:p>
+    <w:p>
+      <w:pPr>
         <w:jc w:val="both"/>
       </w:pPr>
       <w:r>
@@ -4646,7 +4717,11 @@
         <w:t>This seminal work introduced Latent Factor Models for collaborative filtering, showing that factorizing the user-item interaction matrix into low-dimensional latent vectors could produce highly accurate recommendations. However, standard matrix factorization relies on inner products of latent vectors, a linear operation limited in its ability to capture complex, non-linear user-item relationship patterns. This limitation directly motivates the use of the Neural Collaborative Filtering (NCF) model in Zenthiqa, which replaces the inner product with a multi-layer perceptron to learn arbitrary non-linear interaction functions.</w:t>
       </w:r>
     </w:p>
-    <w:p/>
+    <w:p>
+      <w:pPr>
+        <w:spacing w:before="0" w:after="0"/>
+      </w:pPr>
+    </w:p>
     <w:p>
       <w:pPr>
         <w:pStyle w:val="Heading3"/>
@@ -4661,7 +4736,6 @@
     </w:p>
     <w:p>
       <w:pPr>
-        <w:spacing w:line="360" w:lineRule="auto"/>
         <w:jc w:val="both"/>
       </w:pPr>
       <w:r>
@@ -4675,7 +4749,6 @@
     </w:p>
     <w:p>
       <w:pPr>
-        <w:spacing w:line="360" w:lineRule="auto"/>
         <w:jc w:val="both"/>
       </w:pPr>
       <w:r>
@@ -4687,10 +4760,13 @@
         <w:t>Title: Neural Collaborative Filtering. Proceedings of the 26th International World Wide Web Conference, 2017.</w:t>
       </w:r>
     </w:p>
-    <w:p/>
-    <w:p>
-      <w:pPr>
-        <w:spacing w:line="360" w:lineRule="auto"/>
+    <w:p>
+      <w:pPr>
+        <w:spacing w:before="0" w:after="0"/>
+      </w:pPr>
+    </w:p>
+    <w:p>
+      <w:pPr>
         <w:jc w:val="both"/>
       </w:pPr>
       <w:r>
@@ -4702,7 +4778,11 @@
         <w:t>This paper introduced the Neural Collaborative Filtering (NCF) framework, which is the architecture adopted in Zenthiqa. The authors proposed replacing the inner product of traditional matrix factorization with a deep neural network, demonstrating that NCF significantly outperforms traditional matrix factorization methods on multiple real-world benchmark datasets. Zenthiqa adapts this architecture, training the NCF model on implicit feedback derived from the Online Retail purchase history where a purchase event is treated as a positive interaction.</w:t>
       </w:r>
     </w:p>
-    <w:p/>
+    <w:p>
+      <w:pPr>
+        <w:spacing w:before="0" w:after="0"/>
+      </w:pPr>
+    </w:p>
     <w:p>
       <w:pPr>
         <w:pStyle w:val="Heading3"/>
@@ -4717,7 +4797,6 @@
     </w:p>
     <w:p>
       <w:pPr>
-        <w:spacing w:line="360" w:lineRule="auto"/>
         <w:jc w:val="both"/>
       </w:pPr>
       <w:r>
@@ -4731,7 +4810,6 @@
     </w:p>
     <w:p>
       <w:pPr>
-        <w:spacing w:line="360" w:lineRule="auto"/>
         <w:jc w:val="both"/>
       </w:pPr>
       <w:r>
@@ -4743,10 +4821,13 @@
         <w:t>Title: An Overview of Multi-Task Learning in Deep Neural Networks. arXiv preprint arXiv:1706.05098, 2017.</w:t>
       </w:r>
     </w:p>
-    <w:p/>
-    <w:p>
-      <w:pPr>
-        <w:spacing w:line="360" w:lineRule="auto"/>
+    <w:p>
+      <w:pPr>
+        <w:spacing w:before="0" w:after="0"/>
+      </w:pPr>
+    </w:p>
+    <w:p>
+      <w:pPr>
         <w:jc w:val="both"/>
       </w:pPr>
       <w:r>
@@ -4758,7 +4839,11 @@
         <w:t>This comprehensive survey systematically reviewed the paradigm of Multi-Task Learning (MTL) in deep neural networks. MTL trains a single model on multiple related tasks simultaneously, with the rationale that shared internal representations capture richer features than any single-task model. Ruder identified two primary MTL architectures: hard parameter sharing and soft parameter sharing. The Zenthiqa MTL model uses hard parameter sharing, with a single shared encoder feeding into a CLV regression head and a Churn classification head separately.</w:t>
       </w:r>
     </w:p>
-    <w:p/>
+    <w:p>
+      <w:pPr>
+        <w:spacing w:before="0" w:after="0"/>
+      </w:pPr>
+    </w:p>
     <w:p>
       <w:pPr>
         <w:pStyle w:val="Heading3"/>
@@ -4773,7 +4858,6 @@
     </w:p>
     <w:p>
       <w:pPr>
-        <w:spacing w:line="360" w:lineRule="auto"/>
         <w:jc w:val="both"/>
       </w:pPr>
       <w:r>
@@ -4787,7 +4871,6 @@
     </w:p>
     <w:p>
       <w:pPr>
-        <w:spacing w:line="360" w:lineRule="auto"/>
         <w:jc w:val="both"/>
       </w:pPr>
       <w:r>
@@ -4799,10 +4882,13 @@
         <w:t>Title: A Unified Approach to Interpreting Model Predictions. Advances in Neural Information Processing Systems (NeurIPS), 2017.</w:t>
       </w:r>
     </w:p>
-    <w:p/>
-    <w:p>
-      <w:pPr>
-        <w:spacing w:line="360" w:lineRule="auto"/>
+    <w:p>
+      <w:pPr>
+        <w:spacing w:before="0" w:after="0"/>
+      </w:pPr>
+    </w:p>
+    <w:p>
+      <w:pPr>
         <w:jc w:val="both"/>
       </w:pPr>
       <w:r>
@@ -4814,7 +4900,11 @@
         <w:t>This landmark paper introduced SHAP (SHapley Additive exPlanations), a game-theoretic approach to explaining the output of any machine learning model. Grounded in Shapley values from cooperative game theory, SHAP assigns each input feature an importance score representing its marginal contribution. The paper proved that SHAP values are the only additive feature attribution method satisfying local accuracy, missingness, and consistency simultaneously. In Zenthiqa, exact Shapley values are computed over the three RFM features to power the What-If simulator, making the model's output interpretable for non-technical business users.</w:t>
       </w:r>
     </w:p>
-    <w:p/>
+    <w:p>
+      <w:pPr>
+        <w:spacing w:before="0" w:after="0"/>
+      </w:pPr>
+    </w:p>
     <w:p>
       <w:pPr>
         <w:pStyle w:val="Heading3"/>
@@ -4829,7 +4919,6 @@
     </w:p>
     <w:p>
       <w:pPr>
-        <w:spacing w:line="360" w:lineRule="auto"/>
         <w:jc w:val="both"/>
       </w:pPr>
       <w:r>
@@ -4843,7 +4932,6 @@
     </w:p>
     <w:p>
       <w:pPr>
-        <w:spacing w:line="360" w:lineRule="auto"/>
         <w:jc w:val="both"/>
       </w:pPr>
       <w:r>
@@ -4855,10 +4943,13 @@
         <w:t>Title: Hidden Technical Debt in Machine Learning Systems. Advances in Neural Information Processing Systems (NeurIPS), 2015.</w:t>
       </w:r>
     </w:p>
-    <w:p/>
-    <w:p>
-      <w:pPr>
-        <w:spacing w:line="360" w:lineRule="auto"/>
+    <w:p>
+      <w:pPr>
+        <w:spacing w:before="0" w:after="0"/>
+      </w:pPr>
+    </w:p>
+    <w:p>
+      <w:pPr>
         <w:jc w:val="both"/>
       </w:pPr>
       <w:r>
@@ -4884,7 +4975,6 @@
     </w:p>
     <w:p>
       <w:pPr>
-        <w:spacing w:line="360" w:lineRule="auto"/>
         <w:jc w:val="both"/>
       </w:pPr>
       <w:r>
@@ -4927,7 +5017,6 @@
     </w:p>
     <w:p>
       <w:pPr>
-        <w:spacing w:line="360" w:lineRule="auto"/>
         <w:jc w:val="both"/>
       </w:pPr>
       <w:r>
@@ -4953,7 +5042,6 @@
     </w:p>
     <w:p>
       <w:pPr>
-        <w:spacing w:line="360" w:lineRule="auto"/>
         <w:jc w:val="both"/>
       </w:pPr>
       <w:r>
@@ -4965,7 +5053,11 @@
         <w:t>The existing landscape of e-commerce analytics tools suffers from a fundamental fragmentation between data analysis, predictive modeling, and business-facing user interfaces. The specific problems that necessitate the development of Zenthiqa are as follows:</w:t>
       </w:r>
     </w:p>
-    <w:p/>
+    <w:p>
+      <w:pPr>
+        <w:spacing w:before="0" w:after="0"/>
+      </w:pPr>
+    </w:p>
     <w:p>
       <w:pPr>
         <w:pStyle w:val="ListNumber"/>
@@ -5050,7 +5142,6 @@
     </w:p>
     <w:p>
       <w:pPr>
-        <w:spacing w:line="360" w:lineRule="auto"/>
         <w:jc w:val="both"/>
       </w:pPr>
       <w:r>
@@ -5062,10 +5153,13 @@
         <w:t>Traditional Business Intelligence (BI) Tools such as Tableau and Power BI offer powerful data visualization capabilities. However, they are fundamentally backward-looking, describing what has already happened rather than predicting what will happen. They lack predictive modeling capabilities, and integrating a custom machine learning model requires complex scripting that is difficult to maintain.</w:t>
       </w:r>
     </w:p>
-    <w:p/>
-    <w:p>
-      <w:pPr>
-        <w:spacing w:line="360" w:lineRule="auto"/>
+    <w:p>
+      <w:pPr>
+        <w:spacing w:before="0" w:after="0"/>
+      </w:pPr>
+    </w:p>
+    <w:p>
+      <w:pPr>
         <w:jc w:val="both"/>
       </w:pPr>
       <w:r>
@@ -5077,10 +5171,13 @@
         <w:t>CRM Platforms such as Salesforce Einstein Analytics and HubSpot offer a closer integration of customer data with predictive scoring. However, their predictive models are largely proprietary black boxes trained on generic behavioral signals. They do not allow customization of the underlying model architecture, and they do not expose interpretability features that would allow a business manager to understand why a particular customer is predicted to churn.</w:t>
       </w:r>
     </w:p>
-    <w:p/>
-    <w:p>
-      <w:pPr>
-        <w:spacing w:line="360" w:lineRule="auto"/>
+    <w:p>
+      <w:pPr>
+        <w:spacing w:before="0" w:after="0"/>
+      </w:pPr>
+    </w:p>
+    <w:p>
+      <w:pPr>
         <w:jc w:val="both"/>
       </w:pPr>
       <w:r>
@@ -5294,7 +5391,6 @@
     </w:p>
     <w:p>
       <w:pPr>
-        <w:spacing w:line="360" w:lineRule="auto"/>
         <w:jc w:val="both"/>
       </w:pPr>
       <w:r>
@@ -5320,7 +5416,6 @@
     </w:p>
     <w:p>
       <w:pPr>
-        <w:spacing w:line="360" w:lineRule="auto"/>
         <w:jc w:val="both"/>
       </w:pPr>
       <w:r>
@@ -5346,7 +5441,6 @@
     </w:p>
     <w:p>
       <w:pPr>
-        <w:spacing w:line="360" w:lineRule="auto"/>
         <w:jc w:val="both"/>
       </w:pPr>
       <w:r>
@@ -5372,7 +5466,6 @@
     </w:p>
     <w:p>
       <w:pPr>
-        <w:spacing w:line="360" w:lineRule="auto"/>
         <w:jc w:val="both"/>
       </w:pPr>
       <w:r>
@@ -5410,7 +5503,6 @@
     </w:p>
     <w:p>
       <w:pPr>
-        <w:spacing w:line="360" w:lineRule="auto"/>
         <w:jc w:val="both"/>
       </w:pPr>
       <w:r>
@@ -5436,7 +5528,6 @@
     </w:p>
     <w:p>
       <w:pPr>
-        <w:spacing w:line="360" w:lineRule="auto"/>
         <w:jc w:val="both"/>
       </w:pPr>
       <w:r>
@@ -5462,7 +5553,6 @@
     </w:p>
     <w:p>
       <w:pPr>
-        <w:spacing w:line="360" w:lineRule="auto"/>
         <w:jc w:val="both"/>
       </w:pPr>
       <w:r>
@@ -5488,7 +5578,6 @@
     </w:p>
     <w:p>
       <w:pPr>
-        <w:spacing w:line="360" w:lineRule="auto"/>
         <w:jc w:val="both"/>
       </w:pPr>
       <w:r>
@@ -5514,7 +5603,6 @@
     </w:p>
     <w:p>
       <w:pPr>
-        <w:spacing w:line="360" w:lineRule="auto"/>
         <w:jc w:val="both"/>
       </w:pPr>
       <w:r>
@@ -5540,7 +5628,6 @@
     </w:p>
     <w:p>
       <w:pPr>
-        <w:spacing w:line="360" w:lineRule="auto"/>
         <w:jc w:val="both"/>
       </w:pPr>
       <w:r>
@@ -6569,7 +6656,6 @@
     </w:p>
     <w:p>
       <w:pPr>
-        <w:spacing w:line="360" w:lineRule="auto"/>
         <w:jc w:val="both"/>
       </w:pPr>
       <w:r>
@@ -6607,7 +6693,6 @@
     </w:p>
     <w:p>
       <w:pPr>
-        <w:spacing w:line="360" w:lineRule="auto"/>
         <w:jc w:val="both"/>
       </w:pPr>
       <w:r>
@@ -6767,7 +6852,6 @@
     </w:p>
     <w:p>
       <w:pPr>
-        <w:spacing w:line="360" w:lineRule="auto"/>
         <w:jc w:val="both"/>
       </w:pPr>
       <w:r>
@@ -6793,7 +6877,6 @@
     </w:p>
     <w:p>
       <w:pPr>
-        <w:spacing w:line="360" w:lineRule="auto"/>
         <w:jc w:val="both"/>
       </w:pPr>
       <w:r>
@@ -6819,7 +6902,6 @@
     </w:p>
     <w:p>
       <w:pPr>
-        <w:spacing w:line="360" w:lineRule="auto"/>
         <w:jc w:val="both"/>
       </w:pPr>
       <w:r>
@@ -6845,7 +6927,6 @@
     </w:p>
     <w:p>
       <w:pPr>
-        <w:spacing w:line="360" w:lineRule="auto"/>
         <w:jc w:val="both"/>
       </w:pPr>
       <w:r>
@@ -6871,7 +6952,6 @@
     </w:p>
     <w:p>
       <w:pPr>
-        <w:spacing w:line="360" w:lineRule="auto"/>
         <w:jc w:val="both"/>
       </w:pPr>
       <w:r>
@@ -6883,10 +6963,13 @@
         <w:t>The Use Case Diagram identifies the primary actors interacting with the Zenthiqa system and the use cases they can initiate. The two primary actors are the Business Manager (non-technical user) and the System Administrator.</w:t>
       </w:r>
     </w:p>
-    <w:p/>
-    <w:p>
-      <w:pPr>
-        <w:spacing w:line="360" w:lineRule="auto"/>
+    <w:p>
+      <w:pPr>
+        <w:spacing w:before="0" w:after="0"/>
+      </w:pPr>
+    </w:p>
+    <w:p>
+      <w:pPr>
         <w:jc w:val="both"/>
       </w:pPr>
       <w:r>
@@ -6926,7 +7009,11 @@
         <w:t>System Administrator: Update model artifacts on S3, restart the backend service, and monitor application logs on the EC2 instance.</w:t>
       </w:r>
     </w:p>
-    <w:p/>
+    <w:p>
+      <w:pPr>
+        <w:spacing w:before="0" w:after="0"/>
+      </w:pPr>
+    </w:p>
     <w:p>
       <w:pPr>
         <w:jc w:val="center"/>
@@ -6979,7 +7066,11 @@
         <w:t>Fig 1: Use Case Diagram — Zenthiqa E-Commerce Analytics System</w:t>
       </w:r>
     </w:p>
-    <w:p/>
+    <w:p>
+      <w:pPr>
+        <w:spacing w:before="0" w:after="0"/>
+      </w:pPr>
+    </w:p>
     <w:p>
       <w:pPr>
         <w:pStyle w:val="Heading3"/>
@@ -6994,7 +7085,6 @@
     </w:p>
     <w:p>
       <w:pPr>
-        <w:spacing w:line="360" w:lineRule="auto"/>
         <w:jc w:val="both"/>
       </w:pPr>
       <w:r>
@@ -7006,10 +7096,13 @@
         <w:t>The Class Diagram depicts the primary data classes and their relationships within the Zenthiqa backend system.</w:t>
       </w:r>
     </w:p>
-    <w:p/>
-    <w:p>
-      <w:pPr>
-        <w:spacing w:line="360" w:lineRule="auto"/>
+    <w:p>
+      <w:pPr>
+        <w:spacing w:before="0" w:after="0"/>
+      </w:pPr>
+    </w:p>
+    <w:p>
+      <w:pPr>
         <w:jc w:val="both"/>
       </w:pPr>
       <w:r>
@@ -7077,7 +7170,11 @@
         <w:t>NCFModel (nn.Module): Contains customer_embedding and item_embedding layers and three MLP layers. predict() returns a ranked list of product IDs.</w:t>
       </w:r>
     </w:p>
-    <w:p/>
+    <w:p>
+      <w:pPr>
+        <w:spacing w:before="0" w:after="0"/>
+      </w:pPr>
+    </w:p>
     <w:p>
       <w:pPr>
         <w:jc w:val="center"/>
@@ -7130,7 +7227,11 @@
         <w:t>Fig 2: Class Diagram — Zenthiqa Backend Data Classes</w:t>
       </w:r>
     </w:p>
-    <w:p/>
+    <w:p>
+      <w:pPr>
+        <w:spacing w:before="0" w:after="0"/>
+      </w:pPr>
+    </w:p>
     <w:p>
       <w:pPr>
         <w:pStyle w:val="Heading3"/>
@@ -7145,7 +7246,6 @@
     </w:p>
     <w:p>
       <w:pPr>
-        <w:spacing w:line="360" w:lineRule="auto"/>
         <w:jc w:val="both"/>
       </w:pPr>
       <w:r>
@@ -7157,7 +7257,11 @@
         <w:t>The Sequence Diagram illustrates the chronological flow of interactions between system components for the primary use case: a business manager requesting a customer analysis.</w:t>
       </w:r>
     </w:p>
-    <w:p/>
+    <w:p>
+      <w:pPr>
+        <w:spacing w:before="0" w:after="0"/>
+      </w:pPr>
+    </w:p>
     <w:p>
       <w:pPr>
         <w:pStyle w:val="ListNumber"/>
@@ -7284,7 +7388,11 @@
         <w:t>Dashboard renders the CLV card, Churn gauge, SHAP bar chart, and recommendations list.</w:t>
       </w:r>
     </w:p>
-    <w:p/>
+    <w:p>
+      <w:pPr>
+        <w:spacing w:before="0" w:after="0"/>
+      </w:pPr>
+    </w:p>
     <w:p>
       <w:pPr>
         <w:jc w:val="center"/>
@@ -7337,7 +7445,11 @@
         <w:t>Fig 3: Sequence Diagram — Customer Analysis Request Flow</w:t>
       </w:r>
     </w:p>
-    <w:p/>
+    <w:p>
+      <w:pPr>
+        <w:spacing w:before="0" w:after="0"/>
+      </w:pPr>
+    </w:p>
     <w:p>
       <w:pPr>
         <w:pStyle w:val="Heading3"/>
@@ -7352,7 +7464,6 @@
     </w:p>
     <w:p>
       <w:pPr>
-        <w:spacing w:line="360" w:lineRule="auto"/>
         <w:jc w:val="both"/>
       </w:pPr>
       <w:r>
@@ -7364,7 +7475,11 @@
         <w:t>The Block Diagram provides a high-level structural overview of the Zenthiqa system, showing how the major functional blocks connect to each other.</w:t>
       </w:r>
     </w:p>
-    <w:p/>
+    <w:p>
+      <w:pPr>
+        <w:spacing w:before="0" w:after="0"/>
+      </w:pPr>
+    </w:p>
     <w:p>
       <w:pPr>
         <w:pStyle w:val="ListBullet"/>
@@ -7421,7 +7536,11 @@
         <w:t>Presentation Block: The Next.js Frontend receives predictions and renders them as an interactive dashboard.</w:t>
       </w:r>
     </w:p>
-    <w:p/>
+    <w:p>
+      <w:pPr>
+        <w:spacing w:before="0" w:after="0"/>
+      </w:pPr>
+    </w:p>
     <w:p>
       <w:pPr>
         <w:jc w:val="center"/>
@@ -7505,7 +7624,6 @@
     </w:p>
     <w:p>
       <w:pPr>
-        <w:spacing w:line="360" w:lineRule="auto"/>
         <w:jc w:val="both"/>
       </w:pPr>
       <w:r>
@@ -7517,10 +7635,13 @@
         <w:t>The Zenthiqa platform is built using a carefully selected set of modern technologies, each chosen for its specific strengths in the relevant domain:</w:t>
       </w:r>
     </w:p>
-    <w:p/>
-    <w:p>
-      <w:pPr>
-        <w:spacing w:line="360" w:lineRule="auto"/>
+    <w:p>
+      <w:pPr>
+        <w:spacing w:before="0" w:after="0"/>
+      </w:pPr>
+    </w:p>
+    <w:p>
+      <w:pPr>
         <w:jc w:val="both"/>
       </w:pPr>
       <w:r>
@@ -7532,10 +7653,13 @@
         <w:t>Python 3.11: Python serves as the primary language for the backend, data engineering, and machine learning components. Its rich ecosystem of scientific computing libraries (NumPy, Pandas, Scikit-learn) and deep learning frameworks (PyTorch) make it the industry-standard choice for AI/ML applications.</w:t>
       </w:r>
     </w:p>
-    <w:p/>
-    <w:p>
-      <w:pPr>
-        <w:spacing w:line="360" w:lineRule="auto"/>
+    <w:p>
+      <w:pPr>
+        <w:spacing w:before="0" w:after="0"/>
+      </w:pPr>
+    </w:p>
+    <w:p>
+      <w:pPr>
         <w:jc w:val="both"/>
       </w:pPr>
       <w:r>
@@ -7547,10 +7671,13 @@
         <w:t>PyTorch 2.0: PyTorch's dynamic computation graph and imperative programming style make it highly suitable for research-oriented model development. The MTL and NCF models are both implemented as PyTorch nn.Module subclasses, enabling gradient-based optimization through backpropagation via the torch.optim Adam optimizer.</w:t>
       </w:r>
     </w:p>
-    <w:p/>
-    <w:p>
-      <w:pPr>
-        <w:spacing w:line="360" w:lineRule="auto"/>
+    <w:p>
+      <w:pPr>
+        <w:spacing w:before="0" w:after="0"/>
+      </w:pPr>
+    </w:p>
+    <w:p>
+      <w:pPr>
         <w:jc w:val="both"/>
       </w:pPr>
       <w:r>
@@ -7562,10 +7689,13 @@
         <w:t>FastAPI: FastAPI is an asynchronous Python web framework built on Starlette and Pydantic. Its automatic request validation via Pydantic schemas, automatic OpenAPI documentation generation, and native async/await support make it ideal for building high-performance ML serving APIs. It achieves performance comparable to Node.js web servers.</w:t>
       </w:r>
     </w:p>
-    <w:p/>
-    <w:p>
-      <w:pPr>
-        <w:spacing w:line="360" w:lineRule="auto"/>
+    <w:p>
+      <w:pPr>
+        <w:spacing w:before="0" w:after="0"/>
+      </w:pPr>
+    </w:p>
+    <w:p>
+      <w:pPr>
         <w:jc w:val="both"/>
       </w:pPr>
       <w:r>
@@ -7577,10 +7707,13 @@
         <w:t>Next.js 14 (App Router): Next.js provides a production-ready React framework with built-in support for static site generation (SSG). The Zenthiqa frontend uses the App Router paradigm, defining routes through a file-based directory structure. The dashboard components are built as React client components that fetch data from the FastAPI backend using the native fetch API.</w:t>
       </w:r>
     </w:p>
-    <w:p/>
-    <w:p>
-      <w:pPr>
-        <w:spacing w:line="360" w:lineRule="auto"/>
+    <w:p>
+      <w:pPr>
+        <w:spacing w:before="0" w:after="0"/>
+      </w:pPr>
+    </w:p>
+    <w:p>
+      <w:pPr>
         <w:jc w:val="both"/>
       </w:pPr>
       <w:r>
@@ -7592,10 +7725,13 @@
         <w:t>TailwindCSS: TailwindCSS provides a utility-first CSS framework that enables rapid, consistent styling of the dashboard components without writing custom CSS. Its responsive design utilities ensure the dashboard renders correctly across desktop and tablet screen sizes.</w:t>
       </w:r>
     </w:p>
-    <w:p/>
-    <w:p>
-      <w:pPr>
-        <w:spacing w:line="360" w:lineRule="auto"/>
+    <w:p>
+      <w:pPr>
+        <w:spacing w:before="0" w:after="0"/>
+      </w:pPr>
+    </w:p>
+    <w:p>
+      <w:pPr>
         <w:jc w:val="both"/>
       </w:pPr>
       <w:r>
@@ -7607,10 +7743,13 @@
         <w:t>AWS EC2 and S3: The backend is deployed on an AWS EC2 t2.micro instance running Ubuntu 22.04 LTS. All model artifacts and Parquet data files are stored on an AWS S3 bucket, downloaded to the EC2 instance at startup via the Boto3 Python SDK. The frontend is deployed as a static website on a separate S3 bucket.</w:t>
       </w:r>
     </w:p>
-    <w:p/>
-    <w:p>
-      <w:pPr>
-        <w:spacing w:line="360" w:lineRule="auto"/>
+    <w:p>
+      <w:pPr>
+        <w:spacing w:before="0" w:after="0"/>
+      </w:pPr>
+    </w:p>
+    <w:p>
+      <w:pPr>
         <w:jc w:val="both"/>
       </w:pPr>
       <w:r>
@@ -7648,7 +7787,6 @@
     </w:p>
     <w:p>
       <w:pPr>
-        <w:spacing w:line="360" w:lineRule="auto"/>
         <w:jc w:val="both"/>
       </w:pPr>
       <w:r>
@@ -7660,7 +7798,11 @@
         <w:t>The following Python code defines the core MTL neural network using hard parameter sharing:</w:t>
       </w:r>
     </w:p>
-    <w:p/>
+    <w:p>
+      <w:pPr>
+        <w:spacing w:before="0" w:after="0"/>
+      </w:pPr>
+    </w:p>
     <w:p>
       <w:pPr>
         <w:pStyle w:val="NoSpacing"/>
@@ -7724,7 +7866,11 @@
         <w:br/>
       </w:r>
     </w:p>
-    <w:p/>
+    <w:p>
+      <w:pPr>
+        <w:spacing w:before="0" w:after="0"/>
+      </w:pPr>
+    </w:p>
     <w:p>
       <w:pPr>
         <w:pStyle w:val="Heading3"/>
@@ -7737,7 +7883,11 @@
         <w:t>6.2.2 Model Training Loop with Combined Loss</w:t>
       </w:r>
     </w:p>
-    <w:p/>
+    <w:p>
+      <w:pPr>
+        <w:spacing w:before="0" w:after="0"/>
+      </w:pPr>
+    </w:p>
     <w:p>
       <w:pPr>
         <w:pStyle w:val="NoSpacing"/>
@@ -7778,7 +7928,11 @@
         <w:br/>
       </w:r>
     </w:p>
-    <w:p/>
+    <w:p>
+      <w:pPr>
+        <w:spacing w:before="0" w:after="0"/>
+      </w:pPr>
+    </w:p>
     <w:p>
       <w:pPr>
         <w:pStyle w:val="Heading3"/>
@@ -7791,7 +7945,11 @@
         <w:t>6.2.3 FastAPI Customer Prediction Endpoint</w:t>
       </w:r>
     </w:p>
-    <w:p/>
+    <w:p>
+      <w:pPr>
+        <w:spacing w:before="0" w:after="0"/>
+      </w:pPr>
+    </w:p>
     <w:p>
       <w:pPr>
         <w:pStyle w:val="NoSpacing"/>
@@ -7849,7 +8007,11 @@
         <w:br/>
       </w:r>
     </w:p>
-    <w:p/>
+    <w:p>
+      <w:pPr>
+        <w:spacing w:before="0" w:after="0"/>
+      </w:pPr>
+    </w:p>
     <w:p>
       <w:pPr>
         <w:pStyle w:val="Heading3"/>
@@ -7862,7 +8024,11 @@
         <w:t>6.2.4 Exact SHAP Value Computation</w:t>
       </w:r>
     </w:p>
-    <w:p/>
+    <w:p>
+      <w:pPr>
+        <w:spacing w:before="0" w:after="0"/>
+      </w:pPr>
+    </w:p>
     <w:p>
       <w:pPr>
         <w:pStyle w:val="NoSpacing"/>
@@ -7947,7 +8113,6 @@
     </w:p>
     <w:p>
       <w:pPr>
-        <w:spacing w:line="360" w:lineRule="auto"/>
         <w:jc w:val="both"/>
       </w:pPr>
       <w:r>
@@ -7959,7 +8124,11 @@
         <w:t>This section presents the input code used to interact with the Zenthiqa system. The primary input mechanism for the analytical backend is the Customer ID, which is passed as a path parameter to the FastAPI prediction endpoint. Additionally, the batch processing feature accepts a CSV file as input, where the first column contains a list of Customer IDs. The following illustrates the standard input format:</w:t>
       </w:r>
     </w:p>
-    <w:p/>
+    <w:p>
+      <w:pPr>
+        <w:spacing w:before="0" w:after="0"/>
+      </w:pPr>
+    </w:p>
     <w:p>
       <w:pPr>
         <w:pStyle w:val="NoSpacing"/>
@@ -8008,7 +8177,6 @@
     </w:p>
     <w:p>
       <w:pPr>
-        <w:spacing w:line="360" w:lineRule="auto"/>
         <w:jc w:val="both"/>
       </w:pPr>
       <w:r>
@@ -8020,7 +8188,11 @@
         <w:t>The Zenthiqa dashboard interface is built using Next.js and TailwindCSS, providing a modern, responsive user experience. The interface is divided into five primary tabbed sections accessible via the navigation bar at the top of the dashboard. The following screenshots demonstrate the key interface sections of the live deployed application.</w:t>
       </w:r>
     </w:p>
-    <w:p/>
+    <w:p>
+      <w:pPr>
+        <w:spacing w:before="0" w:after="0"/>
+      </w:pPr>
+    </w:p>
     <w:p>
       <w:pPr>
         <w:jc w:val="center"/>
@@ -8073,7 +8245,11 @@
         <w:t>Fig 5: Zenthiqa Overview Dashboard Tab</w:t>
       </w:r>
     </w:p>
-    <w:p/>
+    <w:p>
+      <w:pPr>
+        <w:spacing w:before="0" w:after="0"/>
+      </w:pPr>
+    </w:p>
     <w:p>
       <w:pPr>
         <w:jc w:val="center"/>
@@ -8126,7 +8302,11 @@
         <w:t>Fig 6: AI Insights Generation — Customer Insights Tab</w:t>
       </w:r>
     </w:p>
-    <w:p/>
+    <w:p>
+      <w:pPr>
+        <w:spacing w:before="0" w:after="0"/>
+      </w:pPr>
+    </w:p>
     <w:p>
       <w:pPr>
         <w:jc w:val="center"/>
@@ -8179,7 +8359,11 @@
         <w:t>Fig 7: What-If Simulator with SHAP Feature Attribution</w:t>
       </w:r>
     </w:p>
-    <w:p/>
+    <w:p>
+      <w:pPr>
+        <w:spacing w:before="0" w:after="0"/>
+      </w:pPr>
+    </w:p>
     <w:p>
       <w:pPr>
         <w:jc w:val="center"/>
@@ -8246,7 +8430,6 @@
     </w:p>
     <w:p>
       <w:pPr>
-        <w:spacing w:line="360" w:lineRule="auto"/>
         <w:jc w:val="both"/>
       </w:pPr>
       <w:r>
@@ -8258,7 +8441,11 @@
         <w:t>The following screenshots illustrate the key output screens of the Zenthiqa system, demonstrating the results of the batch processing pipeline, the at-risk customer detection, the automated win-back email generation, and the product recommendation engine.</w:t>
       </w:r>
     </w:p>
-    <w:p/>
+    <w:p>
+      <w:pPr>
+        <w:spacing w:before="0" w:after="0"/>
+      </w:pPr>
+    </w:p>
     <w:p>
       <w:pPr>
         <w:jc w:val="center"/>
@@ -8311,7 +8498,11 @@
         <w:t>Fig 8: Batch Processing Tab — Bulk Customer Analysis</w:t>
       </w:r>
     </w:p>
-    <w:p/>
+    <w:p>
+      <w:pPr>
+        <w:spacing w:before="0" w:after="0"/>
+      </w:pPr>
+    </w:p>
     <w:p>
       <w:pPr>
         <w:jc w:val="center"/>
@@ -8364,7 +8555,11 @@
         <w:t>Fig 9: At-Risk Customers Tab — High Churn Risk Customers</w:t>
       </w:r>
     </w:p>
-    <w:p/>
+    <w:p>
+      <w:pPr>
+        <w:spacing w:before="0" w:after="0"/>
+      </w:pPr>
+    </w:p>
     <w:p>
       <w:pPr>
         <w:jc w:val="center"/>
@@ -8417,7 +8612,11 @@
         <w:t>Fig 11: Automated Win-Back Email Generation Output</w:t>
       </w:r>
     </w:p>
-    <w:p/>
+    <w:p>
+      <w:pPr>
+        <w:spacing w:before="0" w:after="0"/>
+      </w:pPr>
+    </w:p>
     <w:p>
       <w:pPr>
         <w:jc w:val="center"/>
@@ -8501,7 +8700,6 @@
     </w:p>
     <w:p>
       <w:pPr>
-        <w:spacing w:line="360" w:lineRule="auto"/>
         <w:jc w:val="both"/>
       </w:pPr>
       <w:r>
@@ -8539,7 +8737,6 @@
     </w:p>
     <w:p>
       <w:pPr>
-        <w:spacing w:line="360" w:lineRule="auto"/>
         <w:jc w:val="both"/>
       </w:pPr>
       <w:r>
@@ -8621,7 +8818,6 @@
     </w:p>
     <w:p>
       <w:pPr>
-        <w:spacing w:line="360" w:lineRule="auto"/>
         <w:jc w:val="both"/>
       </w:pPr>
       <w:r>
@@ -8633,7 +8829,11 @@
         <w:t>Integration testing verified that the FastAPI backend endpoints correctly orchestrated the interactions between the data layer, model inference layer, and API response serialization layer.</w:t>
       </w:r>
     </w:p>
-    <w:p/>
+    <w:p>
+      <w:pPr>
+        <w:spacing w:before="0" w:after="0"/>
+      </w:pPr>
+    </w:p>
     <w:tbl>
       <w:tblPr>
         <w:tblStyle w:val="TableGrid"/>
@@ -8948,7 +9148,6 @@
     </w:p>
     <w:p>
       <w:pPr>
-        <w:spacing w:line="360" w:lineRule="auto"/>
         <w:jc w:val="both"/>
       </w:pPr>
       <w:r>
@@ -9058,7 +9257,6 @@
     </w:p>
     <w:p>
       <w:pPr>
-        <w:spacing w:line="360" w:lineRule="auto"/>
         <w:jc w:val="both"/>
       </w:pPr>
       <w:r>
@@ -9070,7 +9268,11 @@
         <w:t>Performance testing measured the response time of the backend API endpoints under normal and concurrent load conditions.</w:t>
       </w:r>
     </w:p>
-    <w:p/>
+    <w:p>
+      <w:pPr>
+        <w:spacing w:before="0" w:after="0"/>
+      </w:pPr>
+    </w:p>
     <w:tbl>
       <w:tblPr>
         <w:tblStyle w:val="TableGrid"/>
@@ -9303,7 +9505,6 @@
     </w:p>
     <w:p>
       <w:pPr>
-        <w:spacing w:line="360" w:lineRule="auto"/>
         <w:jc w:val="both"/>
       </w:pPr>
       <w:r>
@@ -9329,7 +9530,6 @@
     </w:p>
     <w:p>
       <w:pPr>
-        <w:spacing w:line="360" w:lineRule="auto"/>
         <w:jc w:val="both"/>
       </w:pPr>
       <w:r>
@@ -9355,7 +9555,6 @@
     </w:p>
     <w:p>
       <w:pPr>
-        <w:spacing w:line="360" w:lineRule="auto"/>
         <w:jc w:val="both"/>
       </w:pPr>
       <w:r>
@@ -9449,7 +9648,6 @@
     </w:p>
     <w:p>
       <w:pPr>
-        <w:spacing w:line="360" w:lineRule="auto"/>
         <w:jc w:val="both"/>
       </w:pPr>
       <w:r>
@@ -9475,7 +9673,6 @@
     </w:p>
     <w:p>
       <w:pPr>
-        <w:spacing w:line="360" w:lineRule="auto"/>
         <w:jc w:val="both"/>
       </w:pPr>
       <w:r>
@@ -9501,7 +9698,6 @@
     </w:p>
     <w:p>
       <w:pPr>
-        <w:spacing w:line="360" w:lineRule="auto"/>
         <w:jc w:val="both"/>
       </w:pPr>
       <w:r>
@@ -9527,7 +9723,6 @@
     </w:p>
     <w:p>
       <w:pPr>
-        <w:spacing w:line="360" w:lineRule="auto"/>
         <w:jc w:val="both"/>
       </w:pPr>
       <w:r>
@@ -9553,7 +9748,6 @@
     </w:p>
     <w:p>
       <w:pPr>
-        <w:spacing w:line="360" w:lineRule="auto"/>
         <w:jc w:val="both"/>
       </w:pPr>
       <w:r>
@@ -9596,7 +9790,6 @@
     </w:p>
     <w:p>
       <w:pPr>
-        <w:spacing w:line="360" w:lineRule="auto"/>
         <w:jc w:val="both"/>
       </w:pPr>
       <w:r>
@@ -9608,10 +9801,13 @@
         <w:t>This project successfully designed, implemented, and deployed Zenthiqa, a comprehensive deep learning microservice platform for e-commerce customer analytics. The project achieves its stated objectives of providing integrated, predictive, and interpretable customer intelligence through a modern, cloud-native web application accessible to business stakeholders without requiring any machine learning expertise.</w:t>
       </w:r>
     </w:p>
-    <w:p/>
-    <w:p>
-      <w:pPr>
-        <w:spacing w:line="360" w:lineRule="auto"/>
+    <w:p>
+      <w:pPr>
+        <w:spacing w:before="0" w:after="0"/>
+      </w:pPr>
+    </w:p>
+    <w:p>
+      <w:pPr>
         <w:jc w:val="both"/>
       </w:pPr>
       <w:r>
@@ -9623,10 +9819,13 @@
         <w:t>The central technical contribution of the project is the Multi-Task Learning (MTL) neural network, which jointly predicts Customer Lifetime Value and Churn Risk from RFM features. By leveraging the correlation between these two tasks through a shared encoder, the model captures richer customer representations than any single-task model could achieve in isolation. The integration of Neural Collaborative Filtering for personalized recommendations, exact Shapley values for model interpretability, and an automated win-back email generation feature further distinguishes Zenthiqa from existing commercial analytics tools.</w:t>
       </w:r>
     </w:p>
-    <w:p/>
-    <w:p>
-      <w:pPr>
-        <w:spacing w:line="360" w:lineRule="auto"/>
+    <w:p>
+      <w:pPr>
+        <w:spacing w:before="0" w:after="0"/>
+      </w:pPr>
+    </w:p>
+    <w:p>
+      <w:pPr>
         <w:jc w:val="both"/>
       </w:pPr>
       <w:r>
@@ -9652,7 +9851,6 @@
     </w:p>
     <w:p>
       <w:pPr>
-        <w:spacing w:line="360" w:lineRule="auto"/>
         <w:jc w:val="both"/>
       </w:pPr>
       <w:r>
@@ -9664,7 +9862,11 @@
         <w:t>While Zenthiqa is a fully functional and deployed system, several avenues for future enhancement have been identified:</w:t>
       </w:r>
     </w:p>
-    <w:p/>
+    <w:p>
+      <w:pPr>
+        <w:spacing w:before="0" w:after="0"/>
+      </w:pPr>
+    </w:p>
     <w:p>
       <w:pPr>
         <w:pStyle w:val="Heading3"/>
@@ -9679,7 +9881,6 @@
     </w:p>
     <w:p>
       <w:pPr>
-        <w:spacing w:line="360" w:lineRule="auto"/>
         <w:jc w:val="both"/>
       </w:pPr>
       <w:r>
@@ -9705,7 +9906,6 @@
     </w:p>
     <w:p>
       <w:pPr>
-        <w:spacing w:line="360" w:lineRule="auto"/>
         <w:jc w:val="both"/>
       </w:pPr>
       <w:r>
@@ -9731,7 +9931,6 @@
     </w:p>
     <w:p>
       <w:pPr>
-        <w:spacing w:line="360" w:lineRule="auto"/>
         <w:jc w:val="both"/>
       </w:pPr>
       <w:r>
@@ -9757,7 +9956,6 @@
     </w:p>
     <w:p>
       <w:pPr>
-        <w:spacing w:line="360" w:lineRule="auto"/>
         <w:jc w:val="both"/>
       </w:pPr>
       <w:r>
@@ -9783,7 +9981,6 @@
     </w:p>
     <w:p>
       <w:pPr>
-        <w:spacing w:line="360" w:lineRule="auto"/>
         <w:jc w:val="both"/>
       </w:pPr>
       <w:r>
@@ -9809,7 +10006,6 @@
     </w:p>
     <w:p>
       <w:pPr>
-        <w:spacing w:line="360" w:lineRule="auto"/>
         <w:jc w:val="both"/>
       </w:pPr>
       <w:r>
@@ -9835,7 +10031,6 @@
     </w:p>
     <w:p>
       <w:pPr>
-        <w:spacing w:line="360" w:lineRule="auto"/>
         <w:jc w:val="both"/>
       </w:pPr>
       <w:r>
@@ -9861,7 +10056,6 @@
     </w:p>
     <w:p>
       <w:pPr>
-        <w:spacing w:line="360" w:lineRule="auto"/>
         <w:jc w:val="both"/>
       </w:pPr>
       <w:r>
@@ -9887,7 +10081,6 @@
     </w:p>
     <w:p>
       <w:pPr>
-        <w:spacing w:line="360" w:lineRule="auto"/>
         <w:jc w:val="both"/>
       </w:pPr>
       <w:r>
@@ -9916,7 +10109,11 @@
         <w:t>CHAPTER 10: REFERENCES</w:t>
       </w:r>
     </w:p>
-    <w:p/>
+    <w:p>
+      <w:pPr>
+        <w:spacing w:before="0" w:after="0"/>
+      </w:pPr>
+    </w:p>
     <w:p>
       <w:pPr>
         <w:spacing w:after="120"/>

</xml_diff>

<commit_message>
Fix header alignment, add page numbers to DOCX, and generate diagrams at 300 DPI
</commit_message>
<xml_diff>
--- a/book/Zenthiqa_Project_Book.docx
+++ b/book/Zenthiqa_Project_Book.docx
@@ -317,9 +317,14 @@
       </w:r>
     </w:p>
     <w:p>
-      <w:r>
-        <w:br w:type="page"/>
-      </w:r>
+      <w:pPr>
+        <w:sectPr>
+          <w:pgSz w:w="12240" w:h="15840"/>
+          <w:pgMar w:top="1440" w:right="1440" w:bottom="1440" w:left="1800" w:header="720" w:footer="720" w:gutter="0"/>
+          <w:cols w:space="720"/>
+          <w:docGrid w:linePitch="360"/>
+        </w:sectPr>
+      </w:pPr>
     </w:p>
     <w:p>
       <w:pPr>
@@ -590,17 +595,14 @@
       </w:r>
     </w:p>
     <w:p>
-      <w:r>
-        <w:br w:type="page"/>
-      </w:r>
-    </w:p>
-    <w:p>
       <w:pPr>
         <w:sectPr>
+          <w:footerReference w:type="default" r:id="rId10"/>
           <w:pgSz w:w="12240" w:h="15840"/>
           <w:pgMar w:top="1440" w:right="1440" w:bottom="1440" w:left="1800" w:header="720" w:footer="720" w:gutter="0"/>
           <w:cols w:space="720"/>
           <w:docGrid w:linePitch="360"/>
+          <w:pgNumType w:fmt="lowerRoman" w:start="1"/>
         </w:sectPr>
       </w:pPr>
     </w:p>
@@ -856,18 +858,15 @@
       </w:r>
     </w:p>
     <w:p>
-      <w:r>
-        <w:br w:type="page"/>
-      </w:r>
-    </w:p>
-    <w:p>
       <w:pPr>
         <w:sectPr>
-          <w:headerReference w:type="default" r:id="rId10"/>
+          <w:headerReference w:type="default" r:id="rId11"/>
+          <w:footerReference w:type="default" r:id="rId12"/>
           <w:pgSz w:w="12240" w:h="15840"/>
           <w:pgMar w:top="720" w:right="1440" w:bottom="1440" w:left="1800" w:header="720" w:footer="720" w:gutter="0"/>
           <w:cols w:space="720"/>
           <w:docGrid w:linePitch="360"/>
+          <w:pgNumType w:fmt="lowerRoman" w:start="1"/>
         </w:sectPr>
       </w:pPr>
     </w:p>
@@ -4153,9 +4152,17 @@
     </w:tbl>
     <w:p/>
     <w:p>
-      <w:r>
-        <w:br w:type="page"/>
-      </w:r>
+      <w:pPr>
+        <w:sectPr>
+          <w:headerReference w:type="default" r:id="rId13"/>
+          <w:footerReference w:type="default" r:id="rId14"/>
+          <w:pgSz w:w="12240" w:h="15840"/>
+          <w:pgMar w:top="1440" w:right="1440" w:bottom="1440" w:left="1800" w:header="720" w:footer="720" w:gutter="0"/>
+          <w:cols w:space="720"/>
+          <w:docGrid w:linePitch="360"/>
+          <w:pgNumType w:fmt="lowerRoman" w:start="1"/>
+        </w:sectPr>
+      </w:pPr>
     </w:p>
     <w:p>
       <w:pPr>
@@ -7034,7 +7041,7 @@
                     <pic:cNvPicPr/>
                   </pic:nvPicPr>
                   <pic:blipFill>
-                    <a:blip r:embed="rId12"/>
+                    <a:blip r:embed="rId16"/>
                     <a:stretch>
                       <a:fillRect/>
                     </a:stretch>
@@ -7195,7 +7202,7 @@
                     <pic:cNvPicPr/>
                   </pic:nvPicPr>
                   <pic:blipFill>
-                    <a:blip r:embed="rId13"/>
+                    <a:blip r:embed="rId17"/>
                     <a:stretch>
                       <a:fillRect/>
                     </a:stretch>
@@ -7413,7 +7420,7 @@
                     <pic:cNvPicPr/>
                   </pic:nvPicPr>
                   <pic:blipFill>
-                    <a:blip r:embed="rId14"/>
+                    <a:blip r:embed="rId18"/>
                     <a:stretch>
                       <a:fillRect/>
                     </a:stretch>
@@ -7561,7 +7568,7 @@
                     <pic:cNvPicPr/>
                   </pic:nvPicPr>
                   <pic:blipFill>
-                    <a:blip r:embed="rId15"/>
+                    <a:blip r:embed="rId19"/>
                     <a:stretch>
                       <a:fillRect/>
                     </a:stretch>
@@ -8213,259 +8220,6 @@
                     <pic:cNvPicPr/>
                   </pic:nvPicPr>
                   <pic:blipFill>
-                    <a:blip r:embed="rId16"/>
-                    <a:stretch>
-                      <a:fillRect/>
-                    </a:stretch>
-                  </pic:blipFill>
-                  <pic:spPr>
-                    <a:xfrm>
-                      <a:off x="0" y="0"/>
-                      <a:ext cx="5029200" cy="2540794"/>
-                    </a:xfrm>
-                    <a:prstGeom prst="rect"/>
-                  </pic:spPr>
-                </pic:pic>
-              </a:graphicData>
-            </a:graphic>
-          </wp:inline>
-        </w:drawing>
-      </w:r>
-    </w:p>
-    <w:p>
-      <w:pPr>
-        <w:jc w:val="center"/>
-      </w:pPr>
-      <w:r>
-        <w:rPr>
-          <w:rFonts w:ascii="Times New Roman" w:hAnsi="Times New Roman"/>
-          <w:b/>
-          <w:sz w:val="22"/>
-        </w:rPr>
-        <w:t>Fig 5: Zenthiqa Overview Dashboard Tab</w:t>
-      </w:r>
-    </w:p>
-    <w:p>
-      <w:pPr>
-        <w:spacing w:before="0" w:after="0"/>
-      </w:pPr>
-    </w:p>
-    <w:p>
-      <w:pPr>
-        <w:jc w:val="center"/>
-      </w:pPr>
-      <w:r>
-        <w:drawing>
-          <wp:inline xmlns:a="http://schemas.openxmlformats.org/drawingml/2006/main" xmlns:pic="http://schemas.openxmlformats.org/drawingml/2006/picture">
-            <wp:extent cx="5029200" cy="2540794"/>
-            <wp:docPr id="8" name="Picture 8"/>
-            <wp:cNvGraphicFramePr>
-              <a:graphicFrameLocks noChangeAspect="1"/>
-            </wp:cNvGraphicFramePr>
-            <a:graphic>
-              <a:graphicData uri="http://schemas.openxmlformats.org/drawingml/2006/picture">
-                <pic:pic>
-                  <pic:nvPicPr>
-                    <pic:cNvPr id="0" name="screenshot_insights.png"/>
-                    <pic:cNvPicPr/>
-                  </pic:nvPicPr>
-                  <pic:blipFill>
-                    <a:blip r:embed="rId17"/>
-                    <a:stretch>
-                      <a:fillRect/>
-                    </a:stretch>
-                  </pic:blipFill>
-                  <pic:spPr>
-                    <a:xfrm>
-                      <a:off x="0" y="0"/>
-                      <a:ext cx="5029200" cy="2540794"/>
-                    </a:xfrm>
-                    <a:prstGeom prst="rect"/>
-                  </pic:spPr>
-                </pic:pic>
-              </a:graphicData>
-            </a:graphic>
-          </wp:inline>
-        </w:drawing>
-      </w:r>
-    </w:p>
-    <w:p>
-      <w:pPr>
-        <w:jc w:val="center"/>
-      </w:pPr>
-      <w:r>
-        <w:rPr>
-          <w:rFonts w:ascii="Times New Roman" w:hAnsi="Times New Roman"/>
-          <w:b/>
-          <w:sz w:val="22"/>
-        </w:rPr>
-        <w:t>Fig 6: AI Insights Generation — Customer Insights Tab</w:t>
-      </w:r>
-    </w:p>
-    <w:p>
-      <w:pPr>
-        <w:spacing w:before="0" w:after="0"/>
-      </w:pPr>
-    </w:p>
-    <w:p>
-      <w:pPr>
-        <w:jc w:val="center"/>
-      </w:pPr>
-      <w:r>
-        <w:drawing>
-          <wp:inline xmlns:a="http://schemas.openxmlformats.org/drawingml/2006/main" xmlns:pic="http://schemas.openxmlformats.org/drawingml/2006/picture">
-            <wp:extent cx="5029200" cy="2540794"/>
-            <wp:docPr id="9" name="Picture 9"/>
-            <wp:cNvGraphicFramePr>
-              <a:graphicFrameLocks noChangeAspect="1"/>
-            </wp:cNvGraphicFramePr>
-            <a:graphic>
-              <a:graphicData uri="http://schemas.openxmlformats.org/drawingml/2006/picture">
-                <pic:pic>
-                  <pic:nvPicPr>
-                    <pic:cNvPr id="0" name="screenshot_simulator.png"/>
-                    <pic:cNvPicPr/>
-                  </pic:nvPicPr>
-                  <pic:blipFill>
-                    <a:blip r:embed="rId18"/>
-                    <a:stretch>
-                      <a:fillRect/>
-                    </a:stretch>
-                  </pic:blipFill>
-                  <pic:spPr>
-                    <a:xfrm>
-                      <a:off x="0" y="0"/>
-                      <a:ext cx="5029200" cy="2540794"/>
-                    </a:xfrm>
-                    <a:prstGeom prst="rect"/>
-                  </pic:spPr>
-                </pic:pic>
-              </a:graphicData>
-            </a:graphic>
-          </wp:inline>
-        </w:drawing>
-      </w:r>
-    </w:p>
-    <w:p>
-      <w:pPr>
-        <w:jc w:val="center"/>
-      </w:pPr>
-      <w:r>
-        <w:rPr>
-          <w:rFonts w:ascii="Times New Roman" w:hAnsi="Times New Roman"/>
-          <w:b/>
-          <w:sz w:val="22"/>
-        </w:rPr>
-        <w:t>Fig 7: What-If Simulator with SHAP Feature Attribution</w:t>
-      </w:r>
-    </w:p>
-    <w:p>
-      <w:pPr>
-        <w:spacing w:before="0" w:after="0"/>
-      </w:pPr>
-    </w:p>
-    <w:p>
-      <w:pPr>
-        <w:jc w:val="center"/>
-      </w:pPr>
-      <w:r>
-        <w:drawing>
-          <wp:inline xmlns:a="http://schemas.openxmlformats.org/drawingml/2006/main" xmlns:pic="http://schemas.openxmlformats.org/drawingml/2006/picture">
-            <wp:extent cx="5029200" cy="2540794"/>
-            <wp:docPr id="10" name="Picture 10"/>
-            <wp:cNvGraphicFramePr>
-              <a:graphicFrameLocks noChangeAspect="1"/>
-            </wp:cNvGraphicFramePr>
-            <a:graphic>
-              <a:graphicData uri="http://schemas.openxmlformats.org/drawingml/2006/picture">
-                <pic:pic>
-                  <pic:nvPicPr>
-                    <pic:cNvPr id="0" name="screenshot_segments.png"/>
-                    <pic:cNvPicPr/>
-                  </pic:nvPicPr>
-                  <pic:blipFill>
-                    <a:blip r:embed="rId19"/>
-                    <a:stretch>
-                      <a:fillRect/>
-                    </a:stretch>
-                  </pic:blipFill>
-                  <pic:spPr>
-                    <a:xfrm>
-                      <a:off x="0" y="0"/>
-                      <a:ext cx="5029200" cy="2540794"/>
-                    </a:xfrm>
-                    <a:prstGeom prst="rect"/>
-                  </pic:spPr>
-                </pic:pic>
-              </a:graphicData>
-            </a:graphic>
-          </wp:inline>
-        </w:drawing>
-      </w:r>
-    </w:p>
-    <w:p>
-      <w:pPr>
-        <w:jc w:val="center"/>
-      </w:pPr>
-      <w:r>
-        <w:rPr>
-          <w:rFonts w:ascii="Times New Roman" w:hAnsi="Times New Roman"/>
-          <w:b/>
-          <w:sz w:val="22"/>
-        </w:rPr>
-        <w:t>Fig 10: Customer Segments Tab — K-Means Clustering Results</w:t>
-      </w:r>
-    </w:p>
-    <w:p>
-      <w:pPr>
-        <w:pStyle w:val="Heading2"/>
-        <w:jc w:val="left"/>
-      </w:pPr>
-      <w:r>
-        <w:rPr>
-          <w:color w:val="000000"/>
-        </w:rPr>
-        <w:t>7.3 Output Screen</w:t>
-      </w:r>
-    </w:p>
-    <w:p>
-      <w:pPr>
-        <w:jc w:val="both"/>
-      </w:pPr>
-      <w:r>
-        <w:rPr>
-          <w:rFonts w:ascii="Times New Roman" w:hAnsi="Times New Roman"/>
-          <w:b w:val="0"/>
-          <w:sz w:val="24"/>
-        </w:rPr>
-        <w:t>The following screenshots illustrate the key output screens of the Zenthiqa system, demonstrating the results of the batch processing pipeline, the at-risk customer detection, the automated win-back email generation, and the product recommendation engine.</w:t>
-      </w:r>
-    </w:p>
-    <w:p>
-      <w:pPr>
-        <w:spacing w:before="0" w:after="0"/>
-      </w:pPr>
-    </w:p>
-    <w:p>
-      <w:pPr>
-        <w:jc w:val="center"/>
-      </w:pPr>
-      <w:r>
-        <w:drawing>
-          <wp:inline xmlns:a="http://schemas.openxmlformats.org/drawingml/2006/main" xmlns:pic="http://schemas.openxmlformats.org/drawingml/2006/picture">
-            <wp:extent cx="5029200" cy="2540794"/>
-            <wp:docPr id="11" name="Picture 11"/>
-            <wp:cNvGraphicFramePr>
-              <a:graphicFrameLocks noChangeAspect="1"/>
-            </wp:cNvGraphicFramePr>
-            <a:graphic>
-              <a:graphicData uri="http://schemas.openxmlformats.org/drawingml/2006/picture">
-                <pic:pic>
-                  <pic:nvPicPr>
-                    <pic:cNvPr id="0" name="screenshot_batch.png"/>
-                    <pic:cNvPicPr/>
-                  </pic:nvPicPr>
-                  <pic:blipFill>
                     <a:blip r:embed="rId20"/>
                     <a:stretch>
                       <a:fillRect/>
@@ -8495,7 +8249,7 @@
           <w:b/>
           <w:sz w:val="22"/>
         </w:rPr>
-        <w:t>Fig 8: Batch Processing Tab — Bulk Customer Analysis</w:t>
+        <w:t>Fig 5: Zenthiqa Overview Dashboard Tab</w:t>
       </w:r>
     </w:p>
     <w:p>
@@ -8511,7 +8265,7 @@
         <w:drawing>
           <wp:inline xmlns:a="http://schemas.openxmlformats.org/drawingml/2006/main" xmlns:pic="http://schemas.openxmlformats.org/drawingml/2006/picture">
             <wp:extent cx="5029200" cy="2540794"/>
-            <wp:docPr id="12" name="Picture 12"/>
+            <wp:docPr id="8" name="Picture 8"/>
             <wp:cNvGraphicFramePr>
               <a:graphicFrameLocks noChangeAspect="1"/>
             </wp:cNvGraphicFramePr>
@@ -8519,7 +8273,7 @@
               <a:graphicData uri="http://schemas.openxmlformats.org/drawingml/2006/picture">
                 <pic:pic>
                   <pic:nvPicPr>
-                    <pic:cNvPr id="0" name="screenshot_atrisk.png"/>
+                    <pic:cNvPr id="0" name="screenshot_insights.png"/>
                     <pic:cNvPicPr/>
                   </pic:nvPicPr>
                   <pic:blipFill>
@@ -8552,7 +8306,7 @@
           <w:b/>
           <w:sz w:val="22"/>
         </w:rPr>
-        <w:t>Fig 9: At-Risk Customers Tab — High Churn Risk Customers</w:t>
+        <w:t>Fig 6: AI Insights Generation — Customer Insights Tab</w:t>
       </w:r>
     </w:p>
     <w:p>
@@ -8568,7 +8322,7 @@
         <w:drawing>
           <wp:inline xmlns:a="http://schemas.openxmlformats.org/drawingml/2006/main" xmlns:pic="http://schemas.openxmlformats.org/drawingml/2006/picture">
             <wp:extent cx="5029200" cy="2540794"/>
-            <wp:docPr id="13" name="Picture 13"/>
+            <wp:docPr id="9" name="Picture 9"/>
             <wp:cNvGraphicFramePr>
               <a:graphicFrameLocks noChangeAspect="1"/>
             </wp:cNvGraphicFramePr>
@@ -8576,7 +8330,7 @@
               <a:graphicData uri="http://schemas.openxmlformats.org/drawingml/2006/picture">
                 <pic:pic>
                   <pic:nvPicPr>
-                    <pic:cNvPr id="0" name="screenshot_email.png"/>
+                    <pic:cNvPr id="0" name="screenshot_simulator.png"/>
                     <pic:cNvPicPr/>
                   </pic:nvPicPr>
                   <pic:blipFill>
@@ -8609,6 +8363,259 @@
           <w:b/>
           <w:sz w:val="22"/>
         </w:rPr>
+        <w:t>Fig 7: What-If Simulator with SHAP Feature Attribution</w:t>
+      </w:r>
+    </w:p>
+    <w:p>
+      <w:pPr>
+        <w:spacing w:before="0" w:after="0"/>
+      </w:pPr>
+    </w:p>
+    <w:p>
+      <w:pPr>
+        <w:jc w:val="center"/>
+      </w:pPr>
+      <w:r>
+        <w:drawing>
+          <wp:inline xmlns:a="http://schemas.openxmlformats.org/drawingml/2006/main" xmlns:pic="http://schemas.openxmlformats.org/drawingml/2006/picture">
+            <wp:extent cx="5029200" cy="2540794"/>
+            <wp:docPr id="10" name="Picture 10"/>
+            <wp:cNvGraphicFramePr>
+              <a:graphicFrameLocks noChangeAspect="1"/>
+            </wp:cNvGraphicFramePr>
+            <a:graphic>
+              <a:graphicData uri="http://schemas.openxmlformats.org/drawingml/2006/picture">
+                <pic:pic>
+                  <pic:nvPicPr>
+                    <pic:cNvPr id="0" name="screenshot_segments.png"/>
+                    <pic:cNvPicPr/>
+                  </pic:nvPicPr>
+                  <pic:blipFill>
+                    <a:blip r:embed="rId23"/>
+                    <a:stretch>
+                      <a:fillRect/>
+                    </a:stretch>
+                  </pic:blipFill>
+                  <pic:spPr>
+                    <a:xfrm>
+                      <a:off x="0" y="0"/>
+                      <a:ext cx="5029200" cy="2540794"/>
+                    </a:xfrm>
+                    <a:prstGeom prst="rect"/>
+                  </pic:spPr>
+                </pic:pic>
+              </a:graphicData>
+            </a:graphic>
+          </wp:inline>
+        </w:drawing>
+      </w:r>
+    </w:p>
+    <w:p>
+      <w:pPr>
+        <w:jc w:val="center"/>
+      </w:pPr>
+      <w:r>
+        <w:rPr>
+          <w:rFonts w:ascii="Times New Roman" w:hAnsi="Times New Roman"/>
+          <w:b/>
+          <w:sz w:val="22"/>
+        </w:rPr>
+        <w:t>Fig 10: Customer Segments Tab — K-Means Clustering Results</w:t>
+      </w:r>
+    </w:p>
+    <w:p>
+      <w:pPr>
+        <w:pStyle w:val="Heading2"/>
+        <w:jc w:val="left"/>
+      </w:pPr>
+      <w:r>
+        <w:rPr>
+          <w:color w:val="000000"/>
+        </w:rPr>
+        <w:t>7.3 Output Screen</w:t>
+      </w:r>
+    </w:p>
+    <w:p>
+      <w:pPr>
+        <w:jc w:val="both"/>
+      </w:pPr>
+      <w:r>
+        <w:rPr>
+          <w:rFonts w:ascii="Times New Roman" w:hAnsi="Times New Roman"/>
+          <w:b w:val="0"/>
+          <w:sz w:val="24"/>
+        </w:rPr>
+        <w:t>The following screenshots illustrate the key output screens of the Zenthiqa system, demonstrating the results of the batch processing pipeline, the at-risk customer detection, the automated win-back email generation, and the product recommendation engine.</w:t>
+      </w:r>
+    </w:p>
+    <w:p>
+      <w:pPr>
+        <w:spacing w:before="0" w:after="0"/>
+      </w:pPr>
+    </w:p>
+    <w:p>
+      <w:pPr>
+        <w:jc w:val="center"/>
+      </w:pPr>
+      <w:r>
+        <w:drawing>
+          <wp:inline xmlns:a="http://schemas.openxmlformats.org/drawingml/2006/main" xmlns:pic="http://schemas.openxmlformats.org/drawingml/2006/picture">
+            <wp:extent cx="5029200" cy="2540794"/>
+            <wp:docPr id="11" name="Picture 11"/>
+            <wp:cNvGraphicFramePr>
+              <a:graphicFrameLocks noChangeAspect="1"/>
+            </wp:cNvGraphicFramePr>
+            <a:graphic>
+              <a:graphicData uri="http://schemas.openxmlformats.org/drawingml/2006/picture">
+                <pic:pic>
+                  <pic:nvPicPr>
+                    <pic:cNvPr id="0" name="screenshot_batch.png"/>
+                    <pic:cNvPicPr/>
+                  </pic:nvPicPr>
+                  <pic:blipFill>
+                    <a:blip r:embed="rId24"/>
+                    <a:stretch>
+                      <a:fillRect/>
+                    </a:stretch>
+                  </pic:blipFill>
+                  <pic:spPr>
+                    <a:xfrm>
+                      <a:off x="0" y="0"/>
+                      <a:ext cx="5029200" cy="2540794"/>
+                    </a:xfrm>
+                    <a:prstGeom prst="rect"/>
+                  </pic:spPr>
+                </pic:pic>
+              </a:graphicData>
+            </a:graphic>
+          </wp:inline>
+        </w:drawing>
+      </w:r>
+    </w:p>
+    <w:p>
+      <w:pPr>
+        <w:jc w:val="center"/>
+      </w:pPr>
+      <w:r>
+        <w:rPr>
+          <w:rFonts w:ascii="Times New Roman" w:hAnsi="Times New Roman"/>
+          <w:b/>
+          <w:sz w:val="22"/>
+        </w:rPr>
+        <w:t>Fig 8: Batch Processing Tab — Bulk Customer Analysis</w:t>
+      </w:r>
+    </w:p>
+    <w:p>
+      <w:pPr>
+        <w:spacing w:before="0" w:after="0"/>
+      </w:pPr>
+    </w:p>
+    <w:p>
+      <w:pPr>
+        <w:jc w:val="center"/>
+      </w:pPr>
+      <w:r>
+        <w:drawing>
+          <wp:inline xmlns:a="http://schemas.openxmlformats.org/drawingml/2006/main" xmlns:pic="http://schemas.openxmlformats.org/drawingml/2006/picture">
+            <wp:extent cx="5029200" cy="2540794"/>
+            <wp:docPr id="12" name="Picture 12"/>
+            <wp:cNvGraphicFramePr>
+              <a:graphicFrameLocks noChangeAspect="1"/>
+            </wp:cNvGraphicFramePr>
+            <a:graphic>
+              <a:graphicData uri="http://schemas.openxmlformats.org/drawingml/2006/picture">
+                <pic:pic>
+                  <pic:nvPicPr>
+                    <pic:cNvPr id="0" name="screenshot_atrisk.png"/>
+                    <pic:cNvPicPr/>
+                  </pic:nvPicPr>
+                  <pic:blipFill>
+                    <a:blip r:embed="rId25"/>
+                    <a:stretch>
+                      <a:fillRect/>
+                    </a:stretch>
+                  </pic:blipFill>
+                  <pic:spPr>
+                    <a:xfrm>
+                      <a:off x="0" y="0"/>
+                      <a:ext cx="5029200" cy="2540794"/>
+                    </a:xfrm>
+                    <a:prstGeom prst="rect"/>
+                  </pic:spPr>
+                </pic:pic>
+              </a:graphicData>
+            </a:graphic>
+          </wp:inline>
+        </w:drawing>
+      </w:r>
+    </w:p>
+    <w:p>
+      <w:pPr>
+        <w:jc w:val="center"/>
+      </w:pPr>
+      <w:r>
+        <w:rPr>
+          <w:rFonts w:ascii="Times New Roman" w:hAnsi="Times New Roman"/>
+          <w:b/>
+          <w:sz w:val="22"/>
+        </w:rPr>
+        <w:t>Fig 9: At-Risk Customers Tab — High Churn Risk Customers</w:t>
+      </w:r>
+    </w:p>
+    <w:p>
+      <w:pPr>
+        <w:spacing w:before="0" w:after="0"/>
+      </w:pPr>
+    </w:p>
+    <w:p>
+      <w:pPr>
+        <w:jc w:val="center"/>
+      </w:pPr>
+      <w:r>
+        <w:drawing>
+          <wp:inline xmlns:a="http://schemas.openxmlformats.org/drawingml/2006/main" xmlns:pic="http://schemas.openxmlformats.org/drawingml/2006/picture">
+            <wp:extent cx="5029200" cy="2540794"/>
+            <wp:docPr id="13" name="Picture 13"/>
+            <wp:cNvGraphicFramePr>
+              <a:graphicFrameLocks noChangeAspect="1"/>
+            </wp:cNvGraphicFramePr>
+            <a:graphic>
+              <a:graphicData uri="http://schemas.openxmlformats.org/drawingml/2006/picture">
+                <pic:pic>
+                  <pic:nvPicPr>
+                    <pic:cNvPr id="0" name="screenshot_email.png"/>
+                    <pic:cNvPicPr/>
+                  </pic:nvPicPr>
+                  <pic:blipFill>
+                    <a:blip r:embed="rId26"/>
+                    <a:stretch>
+                      <a:fillRect/>
+                    </a:stretch>
+                  </pic:blipFill>
+                  <pic:spPr>
+                    <a:xfrm>
+                      <a:off x="0" y="0"/>
+                      <a:ext cx="5029200" cy="2540794"/>
+                    </a:xfrm>
+                    <a:prstGeom prst="rect"/>
+                  </pic:spPr>
+                </pic:pic>
+              </a:graphicData>
+            </a:graphic>
+          </wp:inline>
+        </w:drawing>
+      </w:r>
+    </w:p>
+    <w:p>
+      <w:pPr>
+        <w:jc w:val="center"/>
+      </w:pPr>
+      <w:r>
+        <w:rPr>
+          <w:rFonts w:ascii="Times New Roman" w:hAnsi="Times New Roman"/>
+          <w:b/>
+          <w:sz w:val="22"/>
+        </w:rPr>
         <w:t>Fig 11: Automated Win-Back Email Generation Output</w:t>
       </w:r>
     </w:p>
@@ -8637,7 +8644,7 @@
                     <pic:cNvPicPr/>
                   </pic:nvPicPr>
                   <pic:blipFill>
-                    <a:blip r:embed="rId23"/>
+                    <a:blip r:embed="rId27"/>
                     <a:stretch>
                       <a:fillRect/>
                     </a:stretch>
@@ -10310,14 +10317,83 @@
       </w:r>
     </w:p>
     <w:sectPr>
-      <w:headerReference w:type="default" r:id="rId11"/>
+      <w:footerReference w:type="default" r:id="rId15"/>
       <w:pgSz w:w="12240" w:h="15840"/>
       <w:pgMar w:top="1440" w:right="1440" w:bottom="1440" w:left="1800" w:header="720" w:footer="720" w:gutter="0"/>
       <w:cols w:space="720"/>
       <w:docGrid w:linePitch="360"/>
+      <w:pgNumType w:fmt="decimal" w:start="1"/>
     </w:sectPr>
   </w:body>
 </w:document>
+</file>
+
+<file path=word/footer1.xml><?xml version="1.0" encoding="utf-8"?>
+<w:ftr xmlns:m="http://schemas.openxmlformats.org/officeDocument/2006/math" xmlns:mc="http://schemas.openxmlformats.org/markup-compatibility/2006" xmlns:mo="http://schemas.microsoft.com/office/mac/office/2008/main" xmlns:mv="urn:schemas-microsoft-com:mac:vml" xmlns:o="urn:schemas-microsoft-com:office:office" xmlns:r="http://schemas.openxmlformats.org/officeDocument/2006/relationships" xmlns:v="urn:schemas-microsoft-com:vml" xmlns:w10="urn:schemas-microsoft-com:office:word" xmlns:w14="http://schemas.microsoft.com/office/word/2010/wordml" xmlns:w="http://schemas.openxmlformats.org/wordprocessingml/2006/main" xmlns:wne="http://schemas.microsoft.com/office/word/2006/wordml" xmlns:wp14="http://schemas.microsoft.com/office/word/2010/wordprocessingDrawing" xmlns:wp="http://schemas.openxmlformats.org/drawingml/2006/wordprocessingDrawing" xmlns:wpc="http://schemas.microsoft.com/office/word/2010/wordprocessingCanvas" xmlns:wpg="http://schemas.microsoft.com/office/word/2010/wordprocessingGroup" xmlns:wpi="http://schemas.microsoft.com/office/word/2010/wordprocessingInk" xmlns:wps="http://schemas.microsoft.com/office/word/2010/wordprocessingShape" mc:Ignorable="w14 wp14">
+  <w:p>
+    <w:pPr>
+      <w:pStyle w:val="Footer"/>
+      <w:jc w:val="center"/>
+    </w:pPr>
+    <w:r>
+      <w:fldChar w:fldCharType="begin"/>
+      <w:instrText xml:space="preserve">PAGE</w:instrText>
+      <w:fldChar w:fldCharType="separate"/>
+      <w:fldChar w:fldCharType="end"/>
+    </w:r>
+  </w:p>
+</w:ftr>
+</file>
+
+<file path=word/footer2.xml><?xml version="1.0" encoding="utf-8"?>
+<w:ftr xmlns:m="http://schemas.openxmlformats.org/officeDocument/2006/math" xmlns:mc="http://schemas.openxmlformats.org/markup-compatibility/2006" xmlns:mo="http://schemas.microsoft.com/office/mac/office/2008/main" xmlns:mv="urn:schemas-microsoft-com:mac:vml" xmlns:o="urn:schemas-microsoft-com:office:office" xmlns:r="http://schemas.openxmlformats.org/officeDocument/2006/relationships" xmlns:v="urn:schemas-microsoft-com:vml" xmlns:w10="urn:schemas-microsoft-com:office:word" xmlns:w14="http://schemas.microsoft.com/office/word/2010/wordml" xmlns:w="http://schemas.openxmlformats.org/wordprocessingml/2006/main" xmlns:wne="http://schemas.microsoft.com/office/word/2006/wordml" xmlns:wp14="http://schemas.microsoft.com/office/word/2010/wordprocessingDrawing" xmlns:wp="http://schemas.openxmlformats.org/drawingml/2006/wordprocessingDrawing" xmlns:wpc="http://schemas.microsoft.com/office/word/2010/wordprocessingCanvas" xmlns:wpg="http://schemas.microsoft.com/office/word/2010/wordprocessingGroup" xmlns:wpi="http://schemas.microsoft.com/office/word/2010/wordprocessingInk" xmlns:wps="http://schemas.microsoft.com/office/word/2010/wordprocessingShape" mc:Ignorable="w14 wp14">
+  <w:p>
+    <w:pPr>
+      <w:pStyle w:val="Footer"/>
+      <w:jc w:val="center"/>
+    </w:pPr>
+    <w:r>
+      <w:fldChar w:fldCharType="begin"/>
+      <w:instrText xml:space="preserve">PAGE</w:instrText>
+      <w:fldChar w:fldCharType="separate"/>
+      <w:fldChar w:fldCharType="end"/>
+    </w:r>
+  </w:p>
+</w:ftr>
+</file>
+
+<file path=word/footer3.xml><?xml version="1.0" encoding="utf-8"?>
+<w:ftr xmlns:m="http://schemas.openxmlformats.org/officeDocument/2006/math" xmlns:mc="http://schemas.openxmlformats.org/markup-compatibility/2006" xmlns:mo="http://schemas.microsoft.com/office/mac/office/2008/main" xmlns:mv="urn:schemas-microsoft-com:mac:vml" xmlns:o="urn:schemas-microsoft-com:office:office" xmlns:r="http://schemas.openxmlformats.org/officeDocument/2006/relationships" xmlns:v="urn:schemas-microsoft-com:vml" xmlns:w10="urn:schemas-microsoft-com:office:word" xmlns:w14="http://schemas.microsoft.com/office/word/2010/wordml" xmlns:w="http://schemas.openxmlformats.org/wordprocessingml/2006/main" xmlns:wne="http://schemas.microsoft.com/office/word/2006/wordml" xmlns:wp14="http://schemas.microsoft.com/office/word/2010/wordprocessingDrawing" xmlns:wp="http://schemas.openxmlformats.org/drawingml/2006/wordprocessingDrawing" xmlns:wpc="http://schemas.microsoft.com/office/word/2010/wordprocessingCanvas" xmlns:wpg="http://schemas.microsoft.com/office/word/2010/wordprocessingGroup" xmlns:wpi="http://schemas.microsoft.com/office/word/2010/wordprocessingInk" xmlns:wps="http://schemas.microsoft.com/office/word/2010/wordprocessingShape" mc:Ignorable="w14 wp14">
+  <w:p>
+    <w:pPr>
+      <w:pStyle w:val="Footer"/>
+      <w:jc w:val="center"/>
+    </w:pPr>
+    <w:r>
+      <w:fldChar w:fldCharType="begin"/>
+      <w:instrText xml:space="preserve">PAGE</w:instrText>
+      <w:fldChar w:fldCharType="separate"/>
+      <w:fldChar w:fldCharType="end"/>
+    </w:r>
+  </w:p>
+</w:ftr>
+</file>
+
+<file path=word/footer4.xml><?xml version="1.0" encoding="utf-8"?>
+<w:ftr xmlns:m="http://schemas.openxmlformats.org/officeDocument/2006/math" xmlns:mc="http://schemas.openxmlformats.org/markup-compatibility/2006" xmlns:mo="http://schemas.microsoft.com/office/mac/office/2008/main" xmlns:mv="urn:schemas-microsoft-com:mac:vml" xmlns:o="urn:schemas-microsoft-com:office:office" xmlns:r="http://schemas.openxmlformats.org/officeDocument/2006/relationships" xmlns:v="urn:schemas-microsoft-com:vml" xmlns:w10="urn:schemas-microsoft-com:office:word" xmlns:w14="http://schemas.microsoft.com/office/word/2010/wordml" xmlns:w="http://schemas.openxmlformats.org/wordprocessingml/2006/main" xmlns:wne="http://schemas.microsoft.com/office/word/2006/wordml" xmlns:wp14="http://schemas.microsoft.com/office/word/2010/wordprocessingDrawing" xmlns:wp="http://schemas.openxmlformats.org/drawingml/2006/wordprocessingDrawing" xmlns:wpc="http://schemas.microsoft.com/office/word/2010/wordprocessingCanvas" xmlns:wpg="http://schemas.microsoft.com/office/word/2010/wordprocessingGroup" xmlns:wpi="http://schemas.microsoft.com/office/word/2010/wordprocessingInk" xmlns:wps="http://schemas.microsoft.com/office/word/2010/wordprocessingShape" mc:Ignorable="w14 wp14">
+  <w:p>
+    <w:pPr>
+      <w:pStyle w:val="Footer"/>
+      <w:jc w:val="center"/>
+    </w:pPr>
+    <w:r>
+      <w:fldChar w:fldCharType="begin"/>
+      <w:instrText xml:space="preserve">PAGE</w:instrText>
+      <w:fldChar w:fldCharType="separate"/>
+      <w:fldChar w:fldCharType="end"/>
+    </w:r>
+  </w:p>
+</w:ftr>
 </file>
 
 <file path=word/header1.xml><?xml version="1.0" encoding="utf-8"?>
@@ -10347,16 +10423,17 @@
     <w:tr>
       <w:tc>
         <w:tcPr>
-          <w:tcW w:type="dxa" w:w="2016"/>
+          <w:tcW w:type="dxa" w:w="1584"/>
         </w:tcPr>
         <w:p>
           <w:pPr>
+            <w:spacing w:before="0" w:after="0"/>
             <w:jc w:val="center"/>
           </w:pPr>
           <w:r>
             <w:drawing>
               <wp:inline xmlns:a="http://schemas.openxmlformats.org/drawingml/2006/main" xmlns:pic="http://schemas.openxmlformats.org/drawingml/2006/picture">
-                <wp:extent cx="1097280" cy="1097280"/>
+                <wp:extent cx="822960" cy="822960"/>
                 <wp:docPr id="1" name="Picture 1"/>
                 <wp:cNvGraphicFramePr>
                   <a:graphicFrameLocks noChangeAspect="1"/>
@@ -10377,7 +10454,7 @@
                       <pic:spPr>
                         <a:xfrm>
                           <a:off x="0" y="0"/>
-                          <a:ext cx="1097280" cy="1097280"/>
+                          <a:ext cx="822960" cy="822960"/>
                         </a:xfrm>
                         <a:prstGeom prst="rect"/>
                       </pic:spPr>
@@ -10395,14 +10472,15 @@
         </w:tcPr>
         <w:p>
           <w:pPr>
-            <w:jc w:val="center"/>
+            <w:spacing w:before="0" w:after="0"/>
+            <w:jc w:val="left"/>
           </w:pPr>
           <w:r>
             <w:rPr>
               <w:rFonts w:ascii="Times New Roman" w:hAnsi="Times New Roman"/>
               <w:b/>
               <w:color w:val="C00000"/>
-              <w:sz w:val="26"/>
+              <w:sz w:val="24"/>
             </w:rPr>
             <w:t>CHAITANYA ENGINEERING COLLEGE</w:t>
           </w:r>
@@ -10410,12 +10488,13 @@
         <w:p>
           <w:pPr>
             <w:spacing w:before="0" w:after="0"/>
-            <w:jc w:val="center"/>
+            <w:jc w:val="left"/>
           </w:pPr>
           <w:r>
             <w:rPr>
               <w:rFonts w:ascii="Times New Roman" w:hAnsi="Times New Roman"/>
-              <w:sz w:val="17"/>
+              <w:b w:val="0"/>
+              <w:sz w:val="16"/>
             </w:rPr>
             <w:t>Approved by AICTE - New Delhi, Accredited by NAAC, Affiliated to JNTU-GURAJADA</w:t>
           </w:r>
@@ -10423,40 +10502,29 @@
         <w:p>
           <w:pPr>
             <w:spacing w:before="0" w:after="0"/>
-            <w:jc w:val="center"/>
+            <w:jc w:val="left"/>
           </w:pPr>
           <w:r>
             <w:rPr>
               <w:rFonts w:ascii="Times New Roman" w:hAnsi="Times New Roman"/>
-              <w:sz w:val="17"/>
+              <w:b w:val="0"/>
+              <w:sz w:val="16"/>
             </w:rPr>
-            <w:t>Chaitanya Valley, Kommadi, Madhurawada, Visakhapatnam, Andhra Pradesh - 530048</w:t>
+            <w:t>Chaitanya Valley, Kommadi, Madhurawada, Visakhapatnam, Andhra Pradesh - 530048  www.cec.ac.in</w:t>
           </w:r>
         </w:p>
         <w:p>
           <w:pPr>
             <w:spacing w:before="0" w:after="0"/>
-            <w:jc w:val="center"/>
+            <w:jc w:val="left"/>
           </w:pPr>
           <w:r>
             <w:rPr>
               <w:rFonts w:ascii="Times New Roman" w:hAnsi="Times New Roman"/>
-              <w:sz w:val="17"/>
+              <w:b w:val="0"/>
+              <w:sz w:val="16"/>
             </w:rPr>
-            <w:t>www.cec.ac.in</w:t>
-          </w:r>
-        </w:p>
-        <w:p>
-          <w:pPr>
-            <w:spacing w:before="0" w:after="0"/>
-            <w:jc w:val="center"/>
-          </w:pPr>
-          <w:r>
-            <w:rPr>
-              <w:rFonts w:ascii="Times New Roman" w:hAnsi="Times New Roman"/>
-              <w:sz w:val="17"/>
-            </w:rPr>
-            <w:t>Mail ID: principal@cec.ac.in          Phone Number: 9949993477</w:t>
+            <w:t>Mail ID: principal@cec.ac.in                         Phone Number: 9949993477</w:t>
           </w:r>
         </w:p>
       </w:tc>
@@ -10464,7 +10532,7 @@
   </w:tbl>
   <w:p>
     <w:pPr>
-      <w:spacing w:before="40" w:after="40"/>
+      <w:spacing w:before="20" w:after="0"/>
       <w:pBdr>
         <w:bottom w:val="single" w:sz="6" w:space="1" w:color="000000"/>
       </w:pBdr>

</xml_diff>